<commit_message>
vault backup: 2026-09-28 18:04:38
</commit_message>
<xml_diff>
--- a/ПРЕДМЕТЫ/Математические методы и модели поддержки принятия решений/Лабораторные работы/Отчёт_линейное_программирование_Туровец_В_Ю_ПИЭ_1.docx
+++ b/ПРЕДМЕТЫ/Математические методы и модели поддержки принятия решений/Лабораторные работы/Отчёт_линейное_программирование_Туровец_В_Ю_ПИЭ_1.docx
@@ -1,6 +1,6 @@
 
 <file path=word/document.xml><?xml version="1.0" encoding="utf-8"?>
-<w:document xmlns:wpc="http://schemas.microsoft.com/office/word/2010/wordprocessingCanvas" xmlns:cx="http://schemas.microsoft.com/office/drawing/2014/chartex" xmlns:cx1="http://schemas.microsoft.com/office/drawing/2015/9/8/chartex" xmlns:cx2="http://schemas.microsoft.com/office/drawing/2015/10/21/chartex" xmlns:cx3="http://schemas.microsoft.com/office/drawing/2016/5/9/chartex" xmlns:cx4="http://schemas.microsoft.com/office/drawing/2016/5/10/chartex" xmlns:cx5="http://schemas.microsoft.com/office/drawing/2016/5/11/chartex" xmlns:cx6="http://schemas.microsoft.com/office/drawing/2016/5/12/chartex" xmlns:cx7="http://schemas.microsoft.com/office/drawing/2016/5/13/chartex" xmlns:cx8="http://schemas.microsoft.com/office/drawing/2016/5/14/chartex" xmlns:mc="http://schemas.openxmlformats.org/markup-compatibility/2006" xmlns:aink="http://schemas.microsoft.com/office/drawing/2016/ink" xmlns:am3d="http://schemas.microsoft.com/office/drawing/2017/model3d" xmlns:o="urn:schemas-microsoft-com:office:office" xmlns:r="http://schemas.openxmlformats.org/officeDocument/2006/relationships" xmlns:m="http://schemas.openxmlformats.org/officeDocument/2006/math" xmlns:v="urn:schemas-microsoft-com:vml" xmlns:wp14="http://schemas.microsoft.com/office/word/2010/wordprocessingDrawing" xmlns:wp="http://schemas.openxmlformats.org/drawingml/2006/wordprocessingDrawing" xmlns:w10="urn:schemas-microsoft-com:office:word" xmlns:w="http://schemas.openxmlformats.org/wordprocessingml/2006/main" xmlns:w14="http://schemas.microsoft.com/office/word/2010/wordml" xmlns:w15="http://schemas.microsoft.com/office/word/2012/wordml" xmlns:w16cex="http://schemas.microsoft.com/office/word/2018/wordml/cex" xmlns:w16cid="http://schemas.microsoft.com/office/word/2016/wordml/cid" xmlns:w16="http://schemas.microsoft.com/office/word/2018/wordml" xmlns:w16sdtdh="http://schemas.microsoft.com/office/word/2020/wordml/sdtdatahash" xmlns:w16se="http://schemas.microsoft.com/office/word/2015/wordml/symex" xmlns:wpg="http://schemas.microsoft.com/office/word/2010/wordprocessingGroup" xmlns:wpi="http://schemas.microsoft.com/office/word/2010/wordprocessingInk" xmlns:wne="http://schemas.microsoft.com/office/word/2006/wordml" xmlns:wps="http://schemas.microsoft.com/office/word/2010/wordprocessingShape" mc:Ignorable="w14 w15 w16se w16cid w16 w16cex w16sdtdh wp14">
+<w:document xmlns:wpc="http://schemas.microsoft.com/office/word/2010/wordprocessingCanvas" xmlns:cx="http://schemas.microsoft.com/office/drawing/2014/chartex" xmlns:cx1="http://schemas.microsoft.com/office/drawing/2015/9/8/chartex" xmlns:cx2="http://schemas.microsoft.com/office/drawing/2015/10/21/chartex" xmlns:cx3="http://schemas.microsoft.com/office/drawing/2016/5/9/chartex" xmlns:cx4="http://schemas.microsoft.com/office/drawing/2016/5/10/chartex" xmlns:cx5="http://schemas.microsoft.com/office/drawing/2016/5/11/chartex" xmlns:cx6="http://schemas.microsoft.com/office/drawing/2016/5/12/chartex" xmlns:cx7="http://schemas.microsoft.com/office/drawing/2016/5/13/chartex" xmlns:cx8="http://schemas.microsoft.com/office/drawing/2016/5/14/chartex" xmlns:mc="http://schemas.openxmlformats.org/markup-compatibility/2006" xmlns:aink="http://schemas.microsoft.com/office/drawing/2016/ink" xmlns:am3d="http://schemas.microsoft.com/office/drawing/2017/model3d" xmlns:o="urn:schemas-microsoft-com:office:office" xmlns:oel="http://schemas.microsoft.com/office/2019/extlst" xmlns:r="http://schemas.openxmlformats.org/officeDocument/2006/relationships" xmlns:m="http://schemas.openxmlformats.org/officeDocument/2006/math" xmlns:v="urn:schemas-microsoft-com:vml" xmlns:wp14="http://schemas.microsoft.com/office/word/2010/wordprocessingDrawing" xmlns:wp="http://schemas.openxmlformats.org/drawingml/2006/wordprocessingDrawing" xmlns:w10="urn:schemas-microsoft-com:office:word" xmlns:w="http://schemas.openxmlformats.org/wordprocessingml/2006/main" xmlns:w14="http://schemas.microsoft.com/office/word/2010/wordml" xmlns:w15="http://schemas.microsoft.com/office/word/2012/wordml" xmlns:w16cex="http://schemas.microsoft.com/office/word/2018/wordml/cex" xmlns:w16cid="http://schemas.microsoft.com/office/word/2016/wordml/cid" xmlns:w16="http://schemas.microsoft.com/office/word/2018/wordml" xmlns:w16du="http://schemas.microsoft.com/office/word/2023/wordml/word16du" xmlns:w16sdtdh="http://schemas.microsoft.com/office/word/2020/wordml/sdtdatahash" xmlns:w16sdtfl="http://schemas.microsoft.com/office/word/2024/wordml/sdtformatlock" xmlns:w16se="http://schemas.microsoft.com/office/word/2015/wordml/symex" xmlns:wpg="http://schemas.microsoft.com/office/word/2010/wordprocessingGroup" xmlns:wpi="http://schemas.microsoft.com/office/word/2010/wordprocessingInk" xmlns:wne="http://schemas.microsoft.com/office/word/2006/wordml" xmlns:wps="http://schemas.microsoft.com/office/word/2010/wordprocessingShape" mc:Ignorable="w14 w15 w16se w16cid w16 w16cex w16sdtdh w16sdtfl w16du wp14">
   <w:body>
     <w:p>
       <w:pPr>
@@ -24,7 +24,7 @@
           <w:lang w:eastAsia="ru-RU"/>
         </w:rPr>
         <w:drawing>
-          <wp:anchor distT="0" distB="0" distL="114300" distR="114300" simplePos="0" relativeHeight="251659264" behindDoc="0" locked="0" layoutInCell="1" allowOverlap="1" wp14:anchorId="2598FB02" wp14:editId="78E23E42">
+          <wp:anchor distT="0" distB="0" distL="114300" distR="114300" simplePos="0" relativeHeight="251659264" behindDoc="0" locked="0" layoutInCell="1" allowOverlap="1" wp14:anchorId="2598FB02" wp14:editId="3CAD13D3">
             <wp:simplePos x="0" y="0"/>
             <wp:positionH relativeFrom="margin">
               <wp:posOffset>2897505</wp:posOffset>
@@ -761,7 +761,7 @@
                 <w:sz w:val="26"/>
                 <w:szCs w:val="26"/>
               </w:rPr>
-              <w:t>Б</w:t>
+              <w:t>М9126-09.04</w:t>
             </w:r>
             <w:r>
               <w:rPr>
@@ -769,7 +769,7 @@
                 <w:sz w:val="26"/>
                 <w:szCs w:val="26"/>
               </w:rPr>
-              <w:t>9</w:t>
+              <w:t>.03</w:t>
             </w:r>
             <w:r>
               <w:rPr>
@@ -777,41 +777,9 @@
                 <w:sz w:val="26"/>
                 <w:szCs w:val="26"/>
               </w:rPr>
-              <w:t>1</w:t>
-            </w:r>
-            <w:r>
-              <w:rPr>
-                <w:rFonts w:ascii="Times New Roman" w:hAnsi="Times New Roman" w:cs="Times New Roman"/>
-                <w:sz w:val="26"/>
-                <w:szCs w:val="26"/>
-              </w:rPr>
-              <w:t>21</w:t>
-            </w:r>
-            <w:r>
-              <w:rPr>
-                <w:rFonts w:ascii="Times New Roman" w:hAnsi="Times New Roman" w:cs="Times New Roman"/>
-                <w:sz w:val="26"/>
-                <w:szCs w:val="26"/>
-              </w:rPr>
-              <w:t>-09.03.03</w:t>
-            </w:r>
-            <w:r>
-              <w:rPr>
-                <w:rFonts w:ascii="Times New Roman" w:hAnsi="Times New Roman" w:cs="Times New Roman"/>
-                <w:sz w:val="26"/>
-                <w:szCs w:val="26"/>
-              </w:rPr>
-              <w:t xml:space="preserve">пиэ </w:t>
+              <w:t>кис</w:t>
             </w:r>
             <w:bookmarkEnd w:id="0"/>
-            <w:r>
-              <w:rPr>
-                <w:rFonts w:ascii="Times New Roman" w:hAnsi="Times New Roman" w:cs="Times New Roman"/>
-                <w:sz w:val="26"/>
-                <w:szCs w:val="26"/>
-              </w:rPr>
-              <w:t>1</w:t>
-            </w:r>
           </w:p>
         </w:tc>
       </w:tr>
@@ -869,7 +837,15 @@
                 <w:sz w:val="28"/>
                 <w:szCs w:val="28"/>
               </w:rPr>
-              <w:t>Туровец В. Ю.</w:t>
+              <w:t>Поповкин А. А.</w:t>
+            </w:r>
+            <w:r>
+              <w:rPr>
+                <w:rFonts w:ascii="Times New Roman" w:hAnsi="Times New Roman" w:cs="Times New Roman"/>
+                <w:sz w:val="28"/>
+                <w:szCs w:val="28"/>
+              </w:rPr>
+              <w:t>.</w:t>
             </w:r>
           </w:p>
         </w:tc>
@@ -935,16 +911,14 @@
               </w:rPr>
               <w:t xml:space="preserve">Проверил </w:t>
             </w:r>
-            <w:bookmarkStart w:id="1" w:name="должность_преподавателя"/>
             <w:r>
               <w:rPr>
                 <w:rFonts w:ascii="Times New Roman" w:hAnsi="Times New Roman" w:cs="Times New Roman"/>
                 <w:sz w:val="28"/>
                 <w:szCs w:val="28"/>
               </w:rPr>
-              <w:t>должность преподавателя</w:t>
+              <w:t>доцент</w:t>
             </w:r>
-            <w:bookmarkEnd w:id="1"/>
           </w:p>
         </w:tc>
       </w:tr>
@@ -1150,7 +1124,15 @@
           <w:sz w:val="28"/>
           <w:szCs w:val="28"/>
         </w:rPr>
-        <w:t>2023</w:t>
+        <w:t>202</w:t>
+      </w:r>
+      <w:r>
+        <w:rPr>
+          <w:rFonts w:ascii="Times New Roman" w:hAnsi="Times New Roman" w:cs="Times New Roman"/>
+          <w:sz w:val="28"/>
+          <w:szCs w:val="28"/>
+        </w:rPr>
+        <w:t>6</w:t>
       </w:r>
       <w:r>
         <w:rPr>
@@ -1709,7 +1691,7 @@
                 <w:sz w:val="28"/>
                 <w:szCs w:val="28"/>
               </w:rPr>
-              <w:t>15</w:t>
+              <w:t>9</w:t>
             </w:r>
           </w:p>
         </w:tc>
@@ -1787,7 +1769,7 @@
                 <w:sz w:val="28"/>
                 <w:szCs w:val="28"/>
               </w:rPr>
-              <w:t>5</w:t>
+              <w:t>4</w:t>
             </w:r>
           </w:p>
         </w:tc>
@@ -1811,7 +1793,7 @@
                 <w:sz w:val="28"/>
                 <w:szCs w:val="28"/>
               </w:rPr>
-              <w:t>18</w:t>
+              <w:t>12</w:t>
             </w:r>
           </w:p>
         </w:tc>
@@ -1855,7 +1837,16 @@
           <w:sz w:val="28"/>
           <w:szCs w:val="28"/>
         </w:rPr>
-        <w:t>Изучение рынка сбыта показало, что суточный спрос на материал В</w:t>
+        <w:t xml:space="preserve">Изучение рынка сбыта показало, что суточный спрос на материал </w:t>
+      </w:r>
+      <w:r>
+        <w:rPr>
+          <w:rFonts w:ascii="Times New Roman" w:hAnsi="Times New Roman" w:cs="Times New Roman"/>
+          <w:sz w:val="28"/>
+          <w:szCs w:val="28"/>
+          <w:lang w:val="en-US"/>
+        </w:rPr>
+        <w:t>A</w:t>
       </w:r>
       <w:r>
         <w:rPr>
@@ -1872,7 +1863,16 @@
           <w:sz w:val="28"/>
           <w:szCs w:val="28"/>
         </w:rPr>
-        <w:t>никогда не превышает спроса на материал А</w:t>
+        <w:t xml:space="preserve">никогда не превышает спроса на материал </w:t>
+      </w:r>
+      <w:r>
+        <w:rPr>
+          <w:rFonts w:ascii="Times New Roman" w:hAnsi="Times New Roman" w:cs="Times New Roman"/>
+          <w:sz w:val="28"/>
+          <w:szCs w:val="28"/>
+          <w:lang w:val="en-US"/>
+        </w:rPr>
+        <w:t>B</w:t>
       </w:r>
       <w:r>
         <w:rPr>
@@ -1889,7 +1889,23 @@
           <w:sz w:val="28"/>
           <w:szCs w:val="28"/>
         </w:rPr>
-        <w:t>более чем на 3 т.  Кроме того, спрос на материал А</w:t>
+        <w:t xml:space="preserve">более чем на </w:t>
+      </w:r>
+      <w:r>
+        <w:rPr>
+          <w:rFonts w:ascii="Times New Roman" w:hAnsi="Times New Roman" w:cs="Times New Roman"/>
+          <w:sz w:val="28"/>
+          <w:szCs w:val="28"/>
+        </w:rPr>
+        <w:t>1</w:t>
+      </w:r>
+      <w:r>
+        <w:rPr>
+          <w:rFonts w:ascii="Times New Roman" w:hAnsi="Times New Roman" w:cs="Times New Roman"/>
+          <w:sz w:val="28"/>
+          <w:szCs w:val="28"/>
+        </w:rPr>
+        <w:t xml:space="preserve"> т.  Кроме того, спрос на материал А</w:t>
       </w:r>
       <w:r>
         <w:rPr>
@@ -1906,7 +1922,23 @@
           <w:sz w:val="28"/>
           <w:szCs w:val="28"/>
         </w:rPr>
-        <w:t xml:space="preserve">никогда не превышает 5 т в сутки. Оптовые цены одной тонны материалов равны: 4000 у. е. для </w:t>
+        <w:t xml:space="preserve">никогда не превышает </w:t>
+      </w:r>
+      <w:r>
+        <w:rPr>
+          <w:rFonts w:ascii="Times New Roman" w:hAnsi="Times New Roman" w:cs="Times New Roman"/>
+          <w:sz w:val="28"/>
+          <w:szCs w:val="28"/>
+        </w:rPr>
+        <w:t>3</w:t>
+      </w:r>
+      <w:r>
+        <w:rPr>
+          <w:rFonts w:ascii="Times New Roman" w:hAnsi="Times New Roman" w:cs="Times New Roman"/>
+          <w:sz w:val="28"/>
+          <w:szCs w:val="28"/>
+        </w:rPr>
+        <w:t xml:space="preserve"> т в сутки. Оптовые цены одной тонны материалов равны: 4000 у. е. для </w:t>
       </w:r>
       <w:r>
         <w:rPr>
@@ -2376,6 +2408,7 @@
       <w:r>
         <w:rPr>
           <w:rFonts w:ascii="Times New Roman" w:hAnsi="Times New Roman" w:cs="Times New Roman"/>
+          <w:i/>
           <w:sz w:val="28"/>
           <w:szCs w:val="28"/>
         </w:rPr>
@@ -2455,27 +2488,43 @@
           <w:sz w:val="28"/>
           <w:szCs w:val="28"/>
         </w:rPr>
-        <w:t xml:space="preserve"> 15,</w:t>
-      </w:r>
-    </w:p>
-    <w:p>
-      <w:pPr>
-        <w:spacing w:line="360" w:lineRule="auto"/>
-        <w:ind w:firstLine="454"/>
-        <w:jc w:val="center"/>
-        <w:rPr>
-          <w:rFonts w:ascii="Times New Roman" w:hAnsi="Times New Roman" w:cs="Times New Roman"/>
-          <w:sz w:val="28"/>
-          <w:szCs w:val="28"/>
-        </w:rPr>
-      </w:pPr>
-      <w:r>
-        <w:rPr>
-          <w:rFonts w:ascii="Times New Roman" w:hAnsi="Times New Roman" w:cs="Times New Roman"/>
-          <w:sz w:val="28"/>
-          <w:szCs w:val="28"/>
-        </w:rPr>
-        <w:t>5</w:t>
+        <w:t xml:space="preserve"> </w:t>
+      </w:r>
+      <w:r>
+        <w:rPr>
+          <w:rFonts w:ascii="Times New Roman" w:hAnsi="Times New Roman" w:cs="Times New Roman"/>
+          <w:sz w:val="28"/>
+          <w:szCs w:val="28"/>
+        </w:rPr>
+        <w:t>9</w:t>
+      </w:r>
+      <w:r>
+        <w:rPr>
+          <w:rFonts w:ascii="Times New Roman" w:hAnsi="Times New Roman" w:cs="Times New Roman"/>
+          <w:sz w:val="28"/>
+          <w:szCs w:val="28"/>
+        </w:rPr>
+        <w:t>,</w:t>
+      </w:r>
+    </w:p>
+    <w:p>
+      <w:pPr>
+        <w:spacing w:line="360" w:lineRule="auto"/>
+        <w:ind w:firstLine="454"/>
+        <w:jc w:val="center"/>
+        <w:rPr>
+          <w:rFonts w:ascii="Times New Roman" w:hAnsi="Times New Roman" w:cs="Times New Roman"/>
+          <w:sz w:val="28"/>
+          <w:szCs w:val="28"/>
+        </w:rPr>
+      </w:pPr>
+      <w:r>
+        <w:rPr>
+          <w:rFonts w:ascii="Times New Roman" w:hAnsi="Times New Roman" w:cs="Times New Roman"/>
+          <w:sz w:val="28"/>
+          <w:szCs w:val="28"/>
+        </w:rPr>
+        <w:t>4</w:t>
       </w:r>
       <w:r>
         <w:rPr>
@@ -2551,7 +2600,23 @@
           <w:sz w:val="28"/>
           <w:szCs w:val="28"/>
         </w:rPr>
-        <w:t xml:space="preserve"> 18.</w:t>
+        <w:t xml:space="preserve"> </w:t>
+      </w:r>
+      <w:r>
+        <w:rPr>
+          <w:rFonts w:ascii="Times New Roman" w:hAnsi="Times New Roman" w:cs="Times New Roman"/>
+          <w:sz w:val="28"/>
+          <w:szCs w:val="28"/>
+        </w:rPr>
+        <w:t>12</w:t>
+      </w:r>
+      <w:r>
+        <w:rPr>
+          <w:rFonts w:ascii="Times New Roman" w:hAnsi="Times New Roman" w:cs="Times New Roman"/>
+          <w:sz w:val="28"/>
+          <w:szCs w:val="28"/>
+        </w:rPr>
+        <w:t>.</w:t>
       </w:r>
     </w:p>
     <w:p>
@@ -2624,6 +2689,50 @@
           <w:sz w:val="28"/>
           <w:szCs w:val="28"/>
           <w:vertAlign w:val="subscript"/>
+          <w:lang w:val="en-US"/>
+        </w:rPr>
+        <w:t>2</w:t>
+      </w:r>
+      <w:r>
+        <w:rPr>
+          <w:rFonts w:ascii="Times New Roman" w:hAnsi="Times New Roman" w:cs="Times New Roman"/>
+          <w:sz w:val="28"/>
+          <w:szCs w:val="28"/>
+        </w:rPr>
+        <w:t xml:space="preserve"> </w:t>
+      </w:r>
+      <w:r>
+        <w:rPr>
+          <w:rFonts w:ascii="Times New Roman" w:hAnsi="Times New Roman" w:cs="Times New Roman"/>
+          <w:sz w:val="28"/>
+          <w:szCs w:val="28"/>
+        </w:rPr>
+        <w:sym w:font="Symbol" w:char="F02D"/>
+      </w:r>
+      <w:r>
+        <w:rPr>
+          <w:rFonts w:ascii="Times New Roman" w:hAnsi="Times New Roman" w:cs="Times New Roman"/>
+          <w:sz w:val="28"/>
+          <w:szCs w:val="28"/>
+        </w:rPr>
+        <w:t xml:space="preserve"> </w:t>
+      </w:r>
+      <w:r>
+        <w:rPr>
+          <w:rFonts w:ascii="Times New Roman" w:hAnsi="Times New Roman" w:cs="Times New Roman"/>
+          <w:i/>
+          <w:sz w:val="28"/>
+          <w:szCs w:val="28"/>
+        </w:rPr>
+        <w:t>X</w:t>
+      </w:r>
+      <w:r>
+        <w:rPr>
+          <w:rFonts w:ascii="Times New Roman" w:hAnsi="Times New Roman" w:cs="Times New Roman"/>
+          <w:sz w:val="28"/>
+          <w:szCs w:val="28"/>
+          <w:vertAlign w:val="subscript"/>
+          <w:lang w:val="en-US"/>
         </w:rPr>
         <w:t>1</w:t>
       </w:r>
@@ -2641,7 +2750,7 @@
           <w:sz w:val="28"/>
           <w:szCs w:val="28"/>
         </w:rPr>
-        <w:sym w:font="Symbol" w:char="F02D"/>
+        <w:sym w:font="Symbol" w:char="F0A3"/>
       </w:r>
       <w:r>
         <w:rPr>
@@ -2654,6 +2763,35 @@
       <w:r>
         <w:rPr>
           <w:rFonts w:ascii="Times New Roman" w:hAnsi="Times New Roman" w:cs="Times New Roman"/>
+          <w:sz w:val="28"/>
+          <w:szCs w:val="28"/>
+          <w:lang w:val="en-US"/>
+        </w:rPr>
+        <w:t>1</w:t>
+      </w:r>
+      <w:r>
+        <w:rPr>
+          <w:rFonts w:ascii="Times New Roman" w:hAnsi="Times New Roman" w:cs="Times New Roman"/>
+          <w:sz w:val="28"/>
+          <w:szCs w:val="28"/>
+        </w:rPr>
+        <w:t>,</w:t>
+      </w:r>
+    </w:p>
+    <w:p>
+      <w:pPr>
+        <w:spacing w:line="360" w:lineRule="auto"/>
+        <w:ind w:firstLine="454"/>
+        <w:jc w:val="center"/>
+        <w:rPr>
+          <w:rFonts w:ascii="Times New Roman" w:hAnsi="Times New Roman" w:cs="Times New Roman"/>
+          <w:sz w:val="28"/>
+          <w:szCs w:val="28"/>
+        </w:rPr>
+      </w:pPr>
+      <w:r>
+        <w:rPr>
+          <w:rFonts w:ascii="Times New Roman" w:hAnsi="Times New Roman" w:cs="Times New Roman"/>
           <w:i/>
           <w:sz w:val="28"/>
           <w:szCs w:val="28"/>
@@ -2667,7 +2805,7 @@
           <w:szCs w:val="28"/>
           <w:vertAlign w:val="subscript"/>
         </w:rPr>
-        <w:t>2</w:t>
+        <w:t>1</w:t>
       </w:r>
       <w:r>
         <w:rPr>
@@ -2691,44 +2829,6 @@
           <w:sz w:val="28"/>
           <w:szCs w:val="28"/>
         </w:rPr>
-        <w:t xml:space="preserve"> 3,</w:t>
-      </w:r>
-    </w:p>
-    <w:p>
-      <w:pPr>
-        <w:spacing w:line="360" w:lineRule="auto"/>
-        <w:ind w:firstLine="454"/>
-        <w:jc w:val="center"/>
-        <w:rPr>
-          <w:rFonts w:ascii="Times New Roman" w:hAnsi="Times New Roman" w:cs="Times New Roman"/>
-          <w:sz w:val="28"/>
-          <w:szCs w:val="28"/>
-        </w:rPr>
-      </w:pPr>
-      <w:r>
-        <w:rPr>
-          <w:rFonts w:ascii="Times New Roman" w:hAnsi="Times New Roman" w:cs="Times New Roman"/>
-          <w:i/>
-          <w:sz w:val="28"/>
-          <w:szCs w:val="28"/>
-        </w:rPr>
-        <w:t>X</w:t>
-      </w:r>
-      <w:r>
-        <w:rPr>
-          <w:rFonts w:ascii="Times New Roman" w:hAnsi="Times New Roman" w:cs="Times New Roman"/>
-          <w:sz w:val="28"/>
-          <w:szCs w:val="28"/>
-          <w:vertAlign w:val="subscript"/>
-        </w:rPr>
-        <w:t>1</w:t>
-      </w:r>
-      <w:r>
-        <w:rPr>
-          <w:rFonts w:ascii="Times New Roman" w:hAnsi="Times New Roman" w:cs="Times New Roman"/>
-          <w:sz w:val="28"/>
-          <w:szCs w:val="28"/>
-        </w:rPr>
         <w:t xml:space="preserve"> </w:t>
       </w:r>
       <w:r>
@@ -2736,16 +2836,17 @@
           <w:rFonts w:ascii="Times New Roman" w:hAnsi="Times New Roman" w:cs="Times New Roman"/>
           <w:sz w:val="28"/>
           <w:szCs w:val="28"/>
-        </w:rPr>
-        <w:sym w:font="Symbol" w:char="F0A3"/>
-      </w:r>
-      <w:r>
-        <w:rPr>
-          <w:rFonts w:ascii="Times New Roman" w:hAnsi="Times New Roman" w:cs="Times New Roman"/>
-          <w:sz w:val="28"/>
-          <w:szCs w:val="28"/>
-        </w:rPr>
-        <w:t xml:space="preserve"> 5.</w:t>
+          <w:lang w:val="en-US"/>
+        </w:rPr>
+        <w:t>3</w:t>
+      </w:r>
+      <w:r>
+        <w:rPr>
+          <w:rFonts w:ascii="Times New Roman" w:hAnsi="Times New Roman" w:cs="Times New Roman"/>
+          <w:sz w:val="28"/>
+          <w:szCs w:val="28"/>
+        </w:rPr>
+        <w:t>.</w:t>
       </w:r>
     </w:p>
     <w:p>
@@ -4376,7 +4477,7 @@
 </file>
 
 <file path=word/endnotes.xml><?xml version="1.0" encoding="utf-8"?>
-<w:endnotes xmlns:wpc="http://schemas.microsoft.com/office/word/2010/wordprocessingCanvas" xmlns:cx="http://schemas.microsoft.com/office/drawing/2014/chartex" xmlns:cx1="http://schemas.microsoft.com/office/drawing/2015/9/8/chartex" xmlns:cx2="http://schemas.microsoft.com/office/drawing/2015/10/21/chartex" xmlns:cx3="http://schemas.microsoft.com/office/drawing/2016/5/9/chartex" xmlns:cx4="http://schemas.microsoft.com/office/drawing/2016/5/10/chartex" xmlns:cx5="http://schemas.microsoft.com/office/drawing/2016/5/11/chartex" xmlns:cx6="http://schemas.microsoft.com/office/drawing/2016/5/12/chartex" xmlns:cx7="http://schemas.microsoft.com/office/drawing/2016/5/13/chartex" xmlns:cx8="http://schemas.microsoft.com/office/drawing/2016/5/14/chartex" xmlns:mc="http://schemas.openxmlformats.org/markup-compatibility/2006" xmlns:aink="http://schemas.microsoft.com/office/drawing/2016/ink" xmlns:am3d="http://schemas.microsoft.com/office/drawing/2017/model3d" xmlns:o="urn:schemas-microsoft-com:office:office" xmlns:r="http://schemas.openxmlformats.org/officeDocument/2006/relationships" xmlns:m="http://schemas.openxmlformats.org/officeDocument/2006/math" xmlns:v="urn:schemas-microsoft-com:vml" xmlns:wp14="http://schemas.microsoft.com/office/word/2010/wordprocessingDrawing" xmlns:wp="http://schemas.openxmlformats.org/drawingml/2006/wordprocessingDrawing" xmlns:w10="urn:schemas-microsoft-com:office:word" xmlns:w="http://schemas.openxmlformats.org/wordprocessingml/2006/main" xmlns:w14="http://schemas.microsoft.com/office/word/2010/wordml" xmlns:w15="http://schemas.microsoft.com/office/word/2012/wordml" xmlns:w16cex="http://schemas.microsoft.com/office/word/2018/wordml/cex" xmlns:w16cid="http://schemas.microsoft.com/office/word/2016/wordml/cid" xmlns:w16="http://schemas.microsoft.com/office/word/2018/wordml" xmlns:w16sdtdh="http://schemas.microsoft.com/office/word/2020/wordml/sdtdatahash" xmlns:w16se="http://schemas.microsoft.com/office/word/2015/wordml/symex" xmlns:wpg="http://schemas.microsoft.com/office/word/2010/wordprocessingGroup" xmlns:wpi="http://schemas.microsoft.com/office/word/2010/wordprocessingInk" xmlns:wne="http://schemas.microsoft.com/office/word/2006/wordml" xmlns:wps="http://schemas.microsoft.com/office/word/2010/wordprocessingShape" mc:Ignorable="w14 w15 w16se w16cid w16 w16cex w16sdtdh wp14">
+<w:endnotes xmlns:wpc="http://schemas.microsoft.com/office/word/2010/wordprocessingCanvas" xmlns:cx="http://schemas.microsoft.com/office/drawing/2014/chartex" xmlns:cx1="http://schemas.microsoft.com/office/drawing/2015/9/8/chartex" xmlns:cx2="http://schemas.microsoft.com/office/drawing/2015/10/21/chartex" xmlns:cx3="http://schemas.microsoft.com/office/drawing/2016/5/9/chartex" xmlns:cx4="http://schemas.microsoft.com/office/drawing/2016/5/10/chartex" xmlns:cx5="http://schemas.microsoft.com/office/drawing/2016/5/11/chartex" xmlns:cx6="http://schemas.microsoft.com/office/drawing/2016/5/12/chartex" xmlns:cx7="http://schemas.microsoft.com/office/drawing/2016/5/13/chartex" xmlns:cx8="http://schemas.microsoft.com/office/drawing/2016/5/14/chartex" xmlns:mc="http://schemas.openxmlformats.org/markup-compatibility/2006" xmlns:aink="http://schemas.microsoft.com/office/drawing/2016/ink" xmlns:am3d="http://schemas.microsoft.com/office/drawing/2017/model3d" xmlns:o="urn:schemas-microsoft-com:office:office" xmlns:oel="http://schemas.microsoft.com/office/2019/extlst" xmlns:r="http://schemas.openxmlformats.org/officeDocument/2006/relationships" xmlns:m="http://schemas.openxmlformats.org/officeDocument/2006/math" xmlns:v="urn:schemas-microsoft-com:vml" xmlns:wp14="http://schemas.microsoft.com/office/word/2010/wordprocessingDrawing" xmlns:wp="http://schemas.openxmlformats.org/drawingml/2006/wordprocessingDrawing" xmlns:w10="urn:schemas-microsoft-com:office:word" xmlns:w="http://schemas.openxmlformats.org/wordprocessingml/2006/main" xmlns:w14="http://schemas.microsoft.com/office/word/2010/wordml" xmlns:w15="http://schemas.microsoft.com/office/word/2012/wordml" xmlns:w16cex="http://schemas.microsoft.com/office/word/2018/wordml/cex" xmlns:w16cid="http://schemas.microsoft.com/office/word/2016/wordml/cid" xmlns:w16="http://schemas.microsoft.com/office/word/2018/wordml" xmlns:w16du="http://schemas.microsoft.com/office/word/2023/wordml/word16du" xmlns:w16sdtdh="http://schemas.microsoft.com/office/word/2020/wordml/sdtdatahash" xmlns:w16sdtfl="http://schemas.microsoft.com/office/word/2024/wordml/sdtformatlock" xmlns:w16se="http://schemas.microsoft.com/office/word/2015/wordml/symex" xmlns:wpg="http://schemas.microsoft.com/office/word/2010/wordprocessingGroup" xmlns:wpi="http://schemas.microsoft.com/office/word/2010/wordprocessingInk" xmlns:wne="http://schemas.microsoft.com/office/word/2006/wordml" xmlns:wps="http://schemas.microsoft.com/office/word/2010/wordprocessingShape" mc:Ignorable="w14 w15 w16se w16cid w16 w16cex w16sdtdh w16sdtfl w16du wp14">
   <w:endnote w:type="separator" w:id="-1">
     <w:p>
       <w:pPr>
@@ -4401,7 +4502,7 @@
 </file>
 
 <file path=word/footer1.xml><?xml version="1.0" encoding="utf-8"?>
-<w:ftr xmlns:wpc="http://schemas.microsoft.com/office/word/2010/wordprocessingCanvas" xmlns:cx="http://schemas.microsoft.com/office/drawing/2014/chartex" xmlns:cx1="http://schemas.microsoft.com/office/drawing/2015/9/8/chartex" xmlns:cx2="http://schemas.microsoft.com/office/drawing/2015/10/21/chartex" xmlns:cx3="http://schemas.microsoft.com/office/drawing/2016/5/9/chartex" xmlns:cx4="http://schemas.microsoft.com/office/drawing/2016/5/10/chartex" xmlns:cx5="http://schemas.microsoft.com/office/drawing/2016/5/11/chartex" xmlns:cx6="http://schemas.microsoft.com/office/drawing/2016/5/12/chartex" xmlns:cx7="http://schemas.microsoft.com/office/drawing/2016/5/13/chartex" xmlns:cx8="http://schemas.microsoft.com/office/drawing/2016/5/14/chartex" xmlns:mc="http://schemas.openxmlformats.org/markup-compatibility/2006" xmlns:aink="http://schemas.microsoft.com/office/drawing/2016/ink" xmlns:am3d="http://schemas.microsoft.com/office/drawing/2017/model3d" xmlns:o="urn:schemas-microsoft-com:office:office" xmlns:r="http://schemas.openxmlformats.org/officeDocument/2006/relationships" xmlns:m="http://schemas.openxmlformats.org/officeDocument/2006/math" xmlns:v="urn:schemas-microsoft-com:vml" xmlns:wp14="http://schemas.microsoft.com/office/word/2010/wordprocessingDrawing" xmlns:wp="http://schemas.openxmlformats.org/drawingml/2006/wordprocessingDrawing" xmlns:w10="urn:schemas-microsoft-com:office:word" xmlns:w="http://schemas.openxmlformats.org/wordprocessingml/2006/main" xmlns:w14="http://schemas.microsoft.com/office/word/2010/wordml" xmlns:w15="http://schemas.microsoft.com/office/word/2012/wordml" xmlns:w16cex="http://schemas.microsoft.com/office/word/2018/wordml/cex" xmlns:w16cid="http://schemas.microsoft.com/office/word/2016/wordml/cid" xmlns:w16="http://schemas.microsoft.com/office/word/2018/wordml" xmlns:w16sdtdh="http://schemas.microsoft.com/office/word/2020/wordml/sdtdatahash" xmlns:w16se="http://schemas.microsoft.com/office/word/2015/wordml/symex" xmlns:wpg="http://schemas.microsoft.com/office/word/2010/wordprocessingGroup" xmlns:wpi="http://schemas.microsoft.com/office/word/2010/wordprocessingInk" xmlns:wne="http://schemas.microsoft.com/office/word/2006/wordml" xmlns:wps="http://schemas.microsoft.com/office/word/2010/wordprocessingShape" mc:Ignorable="w14 w15 w16se w16cid w16 w16cex w16sdtdh wp14">
+<w:ftr xmlns:wpc="http://schemas.microsoft.com/office/word/2010/wordprocessingCanvas" xmlns:cx="http://schemas.microsoft.com/office/drawing/2014/chartex" xmlns:cx1="http://schemas.microsoft.com/office/drawing/2015/9/8/chartex" xmlns:cx2="http://schemas.microsoft.com/office/drawing/2015/10/21/chartex" xmlns:cx3="http://schemas.microsoft.com/office/drawing/2016/5/9/chartex" xmlns:cx4="http://schemas.microsoft.com/office/drawing/2016/5/10/chartex" xmlns:cx5="http://schemas.microsoft.com/office/drawing/2016/5/11/chartex" xmlns:cx6="http://schemas.microsoft.com/office/drawing/2016/5/12/chartex" xmlns:cx7="http://schemas.microsoft.com/office/drawing/2016/5/13/chartex" xmlns:cx8="http://schemas.microsoft.com/office/drawing/2016/5/14/chartex" xmlns:mc="http://schemas.openxmlformats.org/markup-compatibility/2006" xmlns:aink="http://schemas.microsoft.com/office/drawing/2016/ink" xmlns:am3d="http://schemas.microsoft.com/office/drawing/2017/model3d" xmlns:o="urn:schemas-microsoft-com:office:office" xmlns:oel="http://schemas.microsoft.com/office/2019/extlst" xmlns:r="http://schemas.openxmlformats.org/officeDocument/2006/relationships" xmlns:m="http://schemas.openxmlformats.org/officeDocument/2006/math" xmlns:v="urn:schemas-microsoft-com:vml" xmlns:wp14="http://schemas.microsoft.com/office/word/2010/wordprocessingDrawing" xmlns:wp="http://schemas.openxmlformats.org/drawingml/2006/wordprocessingDrawing" xmlns:w10="urn:schemas-microsoft-com:office:word" xmlns:w="http://schemas.openxmlformats.org/wordprocessingml/2006/main" xmlns:w14="http://schemas.microsoft.com/office/word/2010/wordml" xmlns:w15="http://schemas.microsoft.com/office/word/2012/wordml" xmlns:w16cex="http://schemas.microsoft.com/office/word/2018/wordml/cex" xmlns:w16cid="http://schemas.microsoft.com/office/word/2016/wordml/cid" xmlns:w16="http://schemas.microsoft.com/office/word/2018/wordml" xmlns:w16du="http://schemas.microsoft.com/office/word/2023/wordml/word16du" xmlns:w16sdtdh="http://schemas.microsoft.com/office/word/2020/wordml/sdtdatahash" xmlns:w16sdtfl="http://schemas.microsoft.com/office/word/2024/wordml/sdtformatlock" xmlns:w16se="http://schemas.microsoft.com/office/word/2015/wordml/symex" xmlns:wpg="http://schemas.microsoft.com/office/word/2010/wordprocessingGroup" xmlns:wpi="http://schemas.microsoft.com/office/word/2010/wordprocessingInk" xmlns:wne="http://schemas.microsoft.com/office/word/2006/wordml" xmlns:wps="http://schemas.microsoft.com/office/word/2010/wordprocessingShape" mc:Ignorable="w14 w15 w16se w16cid w16 w16cex w16sdtdh w16sdtfl w16du wp14">
   <w:p>
     <w:pPr>
       <w:pStyle w:val="a6"/>
@@ -4411,7 +4512,7 @@
 </file>
 
 <file path=word/footer2.xml><?xml version="1.0" encoding="utf-8"?>
-<w:ftr xmlns:wpc="http://schemas.microsoft.com/office/word/2010/wordprocessingCanvas" xmlns:cx="http://schemas.microsoft.com/office/drawing/2014/chartex" xmlns:cx1="http://schemas.microsoft.com/office/drawing/2015/9/8/chartex" xmlns:cx2="http://schemas.microsoft.com/office/drawing/2015/10/21/chartex" xmlns:cx3="http://schemas.microsoft.com/office/drawing/2016/5/9/chartex" xmlns:cx4="http://schemas.microsoft.com/office/drawing/2016/5/10/chartex" xmlns:cx5="http://schemas.microsoft.com/office/drawing/2016/5/11/chartex" xmlns:cx6="http://schemas.microsoft.com/office/drawing/2016/5/12/chartex" xmlns:cx7="http://schemas.microsoft.com/office/drawing/2016/5/13/chartex" xmlns:cx8="http://schemas.microsoft.com/office/drawing/2016/5/14/chartex" xmlns:mc="http://schemas.openxmlformats.org/markup-compatibility/2006" xmlns:aink="http://schemas.microsoft.com/office/drawing/2016/ink" xmlns:am3d="http://schemas.microsoft.com/office/drawing/2017/model3d" xmlns:o="urn:schemas-microsoft-com:office:office" xmlns:r="http://schemas.openxmlformats.org/officeDocument/2006/relationships" xmlns:m="http://schemas.openxmlformats.org/officeDocument/2006/math" xmlns:v="urn:schemas-microsoft-com:vml" xmlns:wp14="http://schemas.microsoft.com/office/word/2010/wordprocessingDrawing" xmlns:wp="http://schemas.openxmlformats.org/drawingml/2006/wordprocessingDrawing" xmlns:w10="urn:schemas-microsoft-com:office:word" xmlns:w="http://schemas.openxmlformats.org/wordprocessingml/2006/main" xmlns:w14="http://schemas.microsoft.com/office/word/2010/wordml" xmlns:w15="http://schemas.microsoft.com/office/word/2012/wordml" xmlns:w16cex="http://schemas.microsoft.com/office/word/2018/wordml/cex" xmlns:w16cid="http://schemas.microsoft.com/office/word/2016/wordml/cid" xmlns:w16="http://schemas.microsoft.com/office/word/2018/wordml" xmlns:w16sdtdh="http://schemas.microsoft.com/office/word/2020/wordml/sdtdatahash" xmlns:w16se="http://schemas.microsoft.com/office/word/2015/wordml/symex" xmlns:wpg="http://schemas.microsoft.com/office/word/2010/wordprocessingGroup" xmlns:wpi="http://schemas.microsoft.com/office/word/2010/wordprocessingInk" xmlns:wne="http://schemas.microsoft.com/office/word/2006/wordml" xmlns:wps="http://schemas.microsoft.com/office/word/2010/wordprocessingShape" mc:Ignorable="w14 w15 w16se w16cid w16 w16cex w16sdtdh wp14">
+<w:ftr xmlns:wpc="http://schemas.microsoft.com/office/word/2010/wordprocessingCanvas" xmlns:cx="http://schemas.microsoft.com/office/drawing/2014/chartex" xmlns:cx1="http://schemas.microsoft.com/office/drawing/2015/9/8/chartex" xmlns:cx2="http://schemas.microsoft.com/office/drawing/2015/10/21/chartex" xmlns:cx3="http://schemas.microsoft.com/office/drawing/2016/5/9/chartex" xmlns:cx4="http://schemas.microsoft.com/office/drawing/2016/5/10/chartex" xmlns:cx5="http://schemas.microsoft.com/office/drawing/2016/5/11/chartex" xmlns:cx6="http://schemas.microsoft.com/office/drawing/2016/5/12/chartex" xmlns:cx7="http://schemas.microsoft.com/office/drawing/2016/5/13/chartex" xmlns:cx8="http://schemas.microsoft.com/office/drawing/2016/5/14/chartex" xmlns:mc="http://schemas.openxmlformats.org/markup-compatibility/2006" xmlns:aink="http://schemas.microsoft.com/office/drawing/2016/ink" xmlns:am3d="http://schemas.microsoft.com/office/drawing/2017/model3d" xmlns:o="urn:schemas-microsoft-com:office:office" xmlns:oel="http://schemas.microsoft.com/office/2019/extlst" xmlns:r="http://schemas.openxmlformats.org/officeDocument/2006/relationships" xmlns:m="http://schemas.openxmlformats.org/officeDocument/2006/math" xmlns:v="urn:schemas-microsoft-com:vml" xmlns:wp14="http://schemas.microsoft.com/office/word/2010/wordprocessingDrawing" xmlns:wp="http://schemas.openxmlformats.org/drawingml/2006/wordprocessingDrawing" xmlns:w10="urn:schemas-microsoft-com:office:word" xmlns:w="http://schemas.openxmlformats.org/wordprocessingml/2006/main" xmlns:w14="http://schemas.microsoft.com/office/word/2010/wordml" xmlns:w15="http://schemas.microsoft.com/office/word/2012/wordml" xmlns:w16cex="http://schemas.microsoft.com/office/word/2018/wordml/cex" xmlns:w16cid="http://schemas.microsoft.com/office/word/2016/wordml/cid" xmlns:w16="http://schemas.microsoft.com/office/word/2018/wordml" xmlns:w16du="http://schemas.microsoft.com/office/word/2023/wordml/word16du" xmlns:w16sdtdh="http://schemas.microsoft.com/office/word/2020/wordml/sdtdatahash" xmlns:w16sdtfl="http://schemas.microsoft.com/office/word/2024/wordml/sdtformatlock" xmlns:w16se="http://schemas.microsoft.com/office/word/2015/wordml/symex" xmlns:wpg="http://schemas.microsoft.com/office/word/2010/wordprocessingGroup" xmlns:wpi="http://schemas.microsoft.com/office/word/2010/wordprocessingInk" xmlns:wne="http://schemas.microsoft.com/office/word/2006/wordml" xmlns:wps="http://schemas.microsoft.com/office/word/2010/wordprocessingShape" mc:Ignorable="w14 w15 w16se w16cid w16 w16cex w16sdtdh w16sdtfl w16du wp14">
   <w:sdt>
     <w:sdtPr>
       <w:rPr>
@@ -4425,7 +4526,6 @@
         <w:docPartUnique/>
       </w:docPartObj>
     </w:sdtPr>
-    <w:sdtEndPr/>
     <w:sdtContent>
       <w:p>
         <w:pPr>
@@ -4484,7 +4584,7 @@
 </file>
 
 <file path=word/footer3.xml><?xml version="1.0" encoding="utf-8"?>
-<w:ftr xmlns:wpc="http://schemas.microsoft.com/office/word/2010/wordprocessingCanvas" xmlns:cx="http://schemas.microsoft.com/office/drawing/2014/chartex" xmlns:cx1="http://schemas.microsoft.com/office/drawing/2015/9/8/chartex" xmlns:cx2="http://schemas.microsoft.com/office/drawing/2015/10/21/chartex" xmlns:cx3="http://schemas.microsoft.com/office/drawing/2016/5/9/chartex" xmlns:cx4="http://schemas.microsoft.com/office/drawing/2016/5/10/chartex" xmlns:cx5="http://schemas.microsoft.com/office/drawing/2016/5/11/chartex" xmlns:cx6="http://schemas.microsoft.com/office/drawing/2016/5/12/chartex" xmlns:cx7="http://schemas.microsoft.com/office/drawing/2016/5/13/chartex" xmlns:cx8="http://schemas.microsoft.com/office/drawing/2016/5/14/chartex" xmlns:mc="http://schemas.openxmlformats.org/markup-compatibility/2006" xmlns:aink="http://schemas.microsoft.com/office/drawing/2016/ink" xmlns:am3d="http://schemas.microsoft.com/office/drawing/2017/model3d" xmlns:o="urn:schemas-microsoft-com:office:office" xmlns:r="http://schemas.openxmlformats.org/officeDocument/2006/relationships" xmlns:m="http://schemas.openxmlformats.org/officeDocument/2006/math" xmlns:v="urn:schemas-microsoft-com:vml" xmlns:wp14="http://schemas.microsoft.com/office/word/2010/wordprocessingDrawing" xmlns:wp="http://schemas.openxmlformats.org/drawingml/2006/wordprocessingDrawing" xmlns:w10="urn:schemas-microsoft-com:office:word" xmlns:w="http://schemas.openxmlformats.org/wordprocessingml/2006/main" xmlns:w14="http://schemas.microsoft.com/office/word/2010/wordml" xmlns:w15="http://schemas.microsoft.com/office/word/2012/wordml" xmlns:w16cex="http://schemas.microsoft.com/office/word/2018/wordml/cex" xmlns:w16cid="http://schemas.microsoft.com/office/word/2016/wordml/cid" xmlns:w16="http://schemas.microsoft.com/office/word/2018/wordml" xmlns:w16sdtdh="http://schemas.microsoft.com/office/word/2020/wordml/sdtdatahash" xmlns:w16se="http://schemas.microsoft.com/office/word/2015/wordml/symex" xmlns:wpg="http://schemas.microsoft.com/office/word/2010/wordprocessingGroup" xmlns:wpi="http://schemas.microsoft.com/office/word/2010/wordprocessingInk" xmlns:wne="http://schemas.microsoft.com/office/word/2006/wordml" xmlns:wps="http://schemas.microsoft.com/office/word/2010/wordprocessingShape" mc:Ignorable="w14 w15 w16se w16cid w16 w16cex w16sdtdh wp14">
+<w:ftr xmlns:wpc="http://schemas.microsoft.com/office/word/2010/wordprocessingCanvas" xmlns:cx="http://schemas.microsoft.com/office/drawing/2014/chartex" xmlns:cx1="http://schemas.microsoft.com/office/drawing/2015/9/8/chartex" xmlns:cx2="http://schemas.microsoft.com/office/drawing/2015/10/21/chartex" xmlns:cx3="http://schemas.microsoft.com/office/drawing/2016/5/9/chartex" xmlns:cx4="http://schemas.microsoft.com/office/drawing/2016/5/10/chartex" xmlns:cx5="http://schemas.microsoft.com/office/drawing/2016/5/11/chartex" xmlns:cx6="http://schemas.microsoft.com/office/drawing/2016/5/12/chartex" xmlns:cx7="http://schemas.microsoft.com/office/drawing/2016/5/13/chartex" xmlns:cx8="http://schemas.microsoft.com/office/drawing/2016/5/14/chartex" xmlns:mc="http://schemas.openxmlformats.org/markup-compatibility/2006" xmlns:aink="http://schemas.microsoft.com/office/drawing/2016/ink" xmlns:am3d="http://schemas.microsoft.com/office/drawing/2017/model3d" xmlns:o="urn:schemas-microsoft-com:office:office" xmlns:oel="http://schemas.microsoft.com/office/2019/extlst" xmlns:r="http://schemas.openxmlformats.org/officeDocument/2006/relationships" xmlns:m="http://schemas.openxmlformats.org/officeDocument/2006/math" xmlns:v="urn:schemas-microsoft-com:vml" xmlns:wp14="http://schemas.microsoft.com/office/word/2010/wordprocessingDrawing" xmlns:wp="http://schemas.openxmlformats.org/drawingml/2006/wordprocessingDrawing" xmlns:w10="urn:schemas-microsoft-com:office:word" xmlns:w="http://schemas.openxmlformats.org/wordprocessingml/2006/main" xmlns:w14="http://schemas.microsoft.com/office/word/2010/wordml" xmlns:w15="http://schemas.microsoft.com/office/word/2012/wordml" xmlns:w16cex="http://schemas.microsoft.com/office/word/2018/wordml/cex" xmlns:w16cid="http://schemas.microsoft.com/office/word/2016/wordml/cid" xmlns:w16="http://schemas.microsoft.com/office/word/2018/wordml" xmlns:w16du="http://schemas.microsoft.com/office/word/2023/wordml/word16du" xmlns:w16sdtdh="http://schemas.microsoft.com/office/word/2020/wordml/sdtdatahash" xmlns:w16sdtfl="http://schemas.microsoft.com/office/word/2024/wordml/sdtformatlock" xmlns:w16se="http://schemas.microsoft.com/office/word/2015/wordml/symex" xmlns:wpg="http://schemas.microsoft.com/office/word/2010/wordprocessingGroup" xmlns:wpi="http://schemas.microsoft.com/office/word/2010/wordprocessingInk" xmlns:wne="http://schemas.microsoft.com/office/word/2006/wordml" xmlns:wps="http://schemas.microsoft.com/office/word/2010/wordprocessingShape" mc:Ignorable="w14 w15 w16se w16cid w16 w16cex w16sdtdh w16sdtfl w16du wp14">
   <w:p>
     <w:pPr>
       <w:pStyle w:val="a6"/>
@@ -4494,7 +4594,7 @@
 </file>
 
 <file path=word/footnotes.xml><?xml version="1.0" encoding="utf-8"?>
-<w:footnotes xmlns:wpc="http://schemas.microsoft.com/office/word/2010/wordprocessingCanvas" xmlns:cx="http://schemas.microsoft.com/office/drawing/2014/chartex" xmlns:cx1="http://schemas.microsoft.com/office/drawing/2015/9/8/chartex" xmlns:cx2="http://schemas.microsoft.com/office/drawing/2015/10/21/chartex" xmlns:cx3="http://schemas.microsoft.com/office/drawing/2016/5/9/chartex" xmlns:cx4="http://schemas.microsoft.com/office/drawing/2016/5/10/chartex" xmlns:cx5="http://schemas.microsoft.com/office/drawing/2016/5/11/chartex" xmlns:cx6="http://schemas.microsoft.com/office/drawing/2016/5/12/chartex" xmlns:cx7="http://schemas.microsoft.com/office/drawing/2016/5/13/chartex" xmlns:cx8="http://schemas.microsoft.com/office/drawing/2016/5/14/chartex" xmlns:mc="http://schemas.openxmlformats.org/markup-compatibility/2006" xmlns:aink="http://schemas.microsoft.com/office/drawing/2016/ink" xmlns:am3d="http://schemas.microsoft.com/office/drawing/2017/model3d" xmlns:o="urn:schemas-microsoft-com:office:office" xmlns:r="http://schemas.openxmlformats.org/officeDocument/2006/relationships" xmlns:m="http://schemas.openxmlformats.org/officeDocument/2006/math" xmlns:v="urn:schemas-microsoft-com:vml" xmlns:wp14="http://schemas.microsoft.com/office/word/2010/wordprocessingDrawing" xmlns:wp="http://schemas.openxmlformats.org/drawingml/2006/wordprocessingDrawing" xmlns:w10="urn:schemas-microsoft-com:office:word" xmlns:w="http://schemas.openxmlformats.org/wordprocessingml/2006/main" xmlns:w14="http://schemas.microsoft.com/office/word/2010/wordml" xmlns:w15="http://schemas.microsoft.com/office/word/2012/wordml" xmlns:w16cex="http://schemas.microsoft.com/office/word/2018/wordml/cex" xmlns:w16cid="http://schemas.microsoft.com/office/word/2016/wordml/cid" xmlns:w16="http://schemas.microsoft.com/office/word/2018/wordml" xmlns:w16sdtdh="http://schemas.microsoft.com/office/word/2020/wordml/sdtdatahash" xmlns:w16se="http://schemas.microsoft.com/office/word/2015/wordml/symex" xmlns:wpg="http://schemas.microsoft.com/office/word/2010/wordprocessingGroup" xmlns:wpi="http://schemas.microsoft.com/office/word/2010/wordprocessingInk" xmlns:wne="http://schemas.microsoft.com/office/word/2006/wordml" xmlns:wps="http://schemas.microsoft.com/office/word/2010/wordprocessingShape" mc:Ignorable="w14 w15 w16se w16cid w16 w16cex w16sdtdh wp14">
+<w:footnotes xmlns:wpc="http://schemas.microsoft.com/office/word/2010/wordprocessingCanvas" xmlns:cx="http://schemas.microsoft.com/office/drawing/2014/chartex" xmlns:cx1="http://schemas.microsoft.com/office/drawing/2015/9/8/chartex" xmlns:cx2="http://schemas.microsoft.com/office/drawing/2015/10/21/chartex" xmlns:cx3="http://schemas.microsoft.com/office/drawing/2016/5/9/chartex" xmlns:cx4="http://schemas.microsoft.com/office/drawing/2016/5/10/chartex" xmlns:cx5="http://schemas.microsoft.com/office/drawing/2016/5/11/chartex" xmlns:cx6="http://schemas.microsoft.com/office/drawing/2016/5/12/chartex" xmlns:cx7="http://schemas.microsoft.com/office/drawing/2016/5/13/chartex" xmlns:cx8="http://schemas.microsoft.com/office/drawing/2016/5/14/chartex" xmlns:mc="http://schemas.openxmlformats.org/markup-compatibility/2006" xmlns:aink="http://schemas.microsoft.com/office/drawing/2016/ink" xmlns:am3d="http://schemas.microsoft.com/office/drawing/2017/model3d" xmlns:o="urn:schemas-microsoft-com:office:office" xmlns:oel="http://schemas.microsoft.com/office/2019/extlst" xmlns:r="http://schemas.openxmlformats.org/officeDocument/2006/relationships" xmlns:m="http://schemas.openxmlformats.org/officeDocument/2006/math" xmlns:v="urn:schemas-microsoft-com:vml" xmlns:wp14="http://schemas.microsoft.com/office/word/2010/wordprocessingDrawing" xmlns:wp="http://schemas.openxmlformats.org/drawingml/2006/wordprocessingDrawing" xmlns:w10="urn:schemas-microsoft-com:office:word" xmlns:w="http://schemas.openxmlformats.org/wordprocessingml/2006/main" xmlns:w14="http://schemas.microsoft.com/office/word/2010/wordml" xmlns:w15="http://schemas.microsoft.com/office/word/2012/wordml" xmlns:w16cex="http://schemas.microsoft.com/office/word/2018/wordml/cex" xmlns:w16cid="http://schemas.microsoft.com/office/word/2016/wordml/cid" xmlns:w16="http://schemas.microsoft.com/office/word/2018/wordml" xmlns:w16du="http://schemas.microsoft.com/office/word/2023/wordml/word16du" xmlns:w16sdtdh="http://schemas.microsoft.com/office/word/2020/wordml/sdtdatahash" xmlns:w16sdtfl="http://schemas.microsoft.com/office/word/2024/wordml/sdtformatlock" xmlns:w16se="http://schemas.microsoft.com/office/word/2015/wordml/symex" xmlns:wpg="http://schemas.microsoft.com/office/word/2010/wordprocessingGroup" xmlns:wpi="http://schemas.microsoft.com/office/word/2010/wordprocessingInk" xmlns:wne="http://schemas.microsoft.com/office/word/2006/wordml" xmlns:wps="http://schemas.microsoft.com/office/word/2010/wordprocessingShape" mc:Ignorable="w14 w15 w16se w16cid w16 w16cex w16sdtdh w16sdtfl w16du wp14">
   <w:footnote w:type="separator" w:id="-1">
     <w:p>
       <w:pPr>
@@ -4519,7 +4619,7 @@
 </file>
 
 <file path=word/header1.xml><?xml version="1.0" encoding="utf-8"?>
-<w:hdr xmlns:wpc="http://schemas.microsoft.com/office/word/2010/wordprocessingCanvas" xmlns:cx="http://schemas.microsoft.com/office/drawing/2014/chartex" xmlns:cx1="http://schemas.microsoft.com/office/drawing/2015/9/8/chartex" xmlns:cx2="http://schemas.microsoft.com/office/drawing/2015/10/21/chartex" xmlns:cx3="http://schemas.microsoft.com/office/drawing/2016/5/9/chartex" xmlns:cx4="http://schemas.microsoft.com/office/drawing/2016/5/10/chartex" xmlns:cx5="http://schemas.microsoft.com/office/drawing/2016/5/11/chartex" xmlns:cx6="http://schemas.microsoft.com/office/drawing/2016/5/12/chartex" xmlns:cx7="http://schemas.microsoft.com/office/drawing/2016/5/13/chartex" xmlns:cx8="http://schemas.microsoft.com/office/drawing/2016/5/14/chartex" xmlns:mc="http://schemas.openxmlformats.org/markup-compatibility/2006" xmlns:aink="http://schemas.microsoft.com/office/drawing/2016/ink" xmlns:am3d="http://schemas.microsoft.com/office/drawing/2017/model3d" xmlns:o="urn:schemas-microsoft-com:office:office" xmlns:r="http://schemas.openxmlformats.org/officeDocument/2006/relationships" xmlns:m="http://schemas.openxmlformats.org/officeDocument/2006/math" xmlns:v="urn:schemas-microsoft-com:vml" xmlns:wp14="http://schemas.microsoft.com/office/word/2010/wordprocessingDrawing" xmlns:wp="http://schemas.openxmlformats.org/drawingml/2006/wordprocessingDrawing" xmlns:w10="urn:schemas-microsoft-com:office:word" xmlns:w="http://schemas.openxmlformats.org/wordprocessingml/2006/main" xmlns:w14="http://schemas.microsoft.com/office/word/2010/wordml" xmlns:w15="http://schemas.microsoft.com/office/word/2012/wordml" xmlns:w16cex="http://schemas.microsoft.com/office/word/2018/wordml/cex" xmlns:w16cid="http://schemas.microsoft.com/office/word/2016/wordml/cid" xmlns:w16="http://schemas.microsoft.com/office/word/2018/wordml" xmlns:w16sdtdh="http://schemas.microsoft.com/office/word/2020/wordml/sdtdatahash" xmlns:w16se="http://schemas.microsoft.com/office/word/2015/wordml/symex" xmlns:wpg="http://schemas.microsoft.com/office/word/2010/wordprocessingGroup" xmlns:wpi="http://schemas.microsoft.com/office/word/2010/wordprocessingInk" xmlns:wne="http://schemas.microsoft.com/office/word/2006/wordml" xmlns:wps="http://schemas.microsoft.com/office/word/2010/wordprocessingShape" mc:Ignorable="w14 w15 w16se w16cid w16 w16cex w16sdtdh wp14">
+<w:hdr xmlns:wpc="http://schemas.microsoft.com/office/word/2010/wordprocessingCanvas" xmlns:cx="http://schemas.microsoft.com/office/drawing/2014/chartex" xmlns:cx1="http://schemas.microsoft.com/office/drawing/2015/9/8/chartex" xmlns:cx2="http://schemas.microsoft.com/office/drawing/2015/10/21/chartex" xmlns:cx3="http://schemas.microsoft.com/office/drawing/2016/5/9/chartex" xmlns:cx4="http://schemas.microsoft.com/office/drawing/2016/5/10/chartex" xmlns:cx5="http://schemas.microsoft.com/office/drawing/2016/5/11/chartex" xmlns:cx6="http://schemas.microsoft.com/office/drawing/2016/5/12/chartex" xmlns:cx7="http://schemas.microsoft.com/office/drawing/2016/5/13/chartex" xmlns:cx8="http://schemas.microsoft.com/office/drawing/2016/5/14/chartex" xmlns:mc="http://schemas.openxmlformats.org/markup-compatibility/2006" xmlns:aink="http://schemas.microsoft.com/office/drawing/2016/ink" xmlns:am3d="http://schemas.microsoft.com/office/drawing/2017/model3d" xmlns:o="urn:schemas-microsoft-com:office:office" xmlns:oel="http://schemas.microsoft.com/office/2019/extlst" xmlns:r="http://schemas.openxmlformats.org/officeDocument/2006/relationships" xmlns:m="http://schemas.openxmlformats.org/officeDocument/2006/math" xmlns:v="urn:schemas-microsoft-com:vml" xmlns:wp14="http://schemas.microsoft.com/office/word/2010/wordprocessingDrawing" xmlns:wp="http://schemas.openxmlformats.org/drawingml/2006/wordprocessingDrawing" xmlns:w10="urn:schemas-microsoft-com:office:word" xmlns:w="http://schemas.openxmlformats.org/wordprocessingml/2006/main" xmlns:w14="http://schemas.microsoft.com/office/word/2010/wordml" xmlns:w15="http://schemas.microsoft.com/office/word/2012/wordml" xmlns:w16cex="http://schemas.microsoft.com/office/word/2018/wordml/cex" xmlns:w16cid="http://schemas.microsoft.com/office/word/2016/wordml/cid" xmlns:w16="http://schemas.microsoft.com/office/word/2018/wordml" xmlns:w16du="http://schemas.microsoft.com/office/word/2023/wordml/word16du" xmlns:w16sdtdh="http://schemas.microsoft.com/office/word/2020/wordml/sdtdatahash" xmlns:w16sdtfl="http://schemas.microsoft.com/office/word/2024/wordml/sdtformatlock" xmlns:w16se="http://schemas.microsoft.com/office/word/2015/wordml/symex" xmlns:wpg="http://schemas.microsoft.com/office/word/2010/wordprocessingGroup" xmlns:wpi="http://schemas.microsoft.com/office/word/2010/wordprocessingInk" xmlns:wne="http://schemas.microsoft.com/office/word/2006/wordml" xmlns:wps="http://schemas.microsoft.com/office/word/2010/wordprocessingShape" mc:Ignorable="w14 w15 w16se w16cid w16 w16cex w16sdtdh w16sdtfl w16du wp14">
   <w:p>
     <w:pPr>
       <w:pStyle w:val="a4"/>
@@ -4529,7 +4629,7 @@
 </file>
 
 <file path=word/header2.xml><?xml version="1.0" encoding="utf-8"?>
-<w:hdr xmlns:wpc="http://schemas.microsoft.com/office/word/2010/wordprocessingCanvas" xmlns:cx="http://schemas.microsoft.com/office/drawing/2014/chartex" xmlns:cx1="http://schemas.microsoft.com/office/drawing/2015/9/8/chartex" xmlns:cx2="http://schemas.microsoft.com/office/drawing/2015/10/21/chartex" xmlns:cx3="http://schemas.microsoft.com/office/drawing/2016/5/9/chartex" xmlns:cx4="http://schemas.microsoft.com/office/drawing/2016/5/10/chartex" xmlns:cx5="http://schemas.microsoft.com/office/drawing/2016/5/11/chartex" xmlns:cx6="http://schemas.microsoft.com/office/drawing/2016/5/12/chartex" xmlns:cx7="http://schemas.microsoft.com/office/drawing/2016/5/13/chartex" xmlns:cx8="http://schemas.microsoft.com/office/drawing/2016/5/14/chartex" xmlns:mc="http://schemas.openxmlformats.org/markup-compatibility/2006" xmlns:aink="http://schemas.microsoft.com/office/drawing/2016/ink" xmlns:am3d="http://schemas.microsoft.com/office/drawing/2017/model3d" xmlns:o="urn:schemas-microsoft-com:office:office" xmlns:r="http://schemas.openxmlformats.org/officeDocument/2006/relationships" xmlns:m="http://schemas.openxmlformats.org/officeDocument/2006/math" xmlns:v="urn:schemas-microsoft-com:vml" xmlns:wp14="http://schemas.microsoft.com/office/word/2010/wordprocessingDrawing" xmlns:wp="http://schemas.openxmlformats.org/drawingml/2006/wordprocessingDrawing" xmlns:w10="urn:schemas-microsoft-com:office:word" xmlns:w="http://schemas.openxmlformats.org/wordprocessingml/2006/main" xmlns:w14="http://schemas.microsoft.com/office/word/2010/wordml" xmlns:w15="http://schemas.microsoft.com/office/word/2012/wordml" xmlns:w16cex="http://schemas.microsoft.com/office/word/2018/wordml/cex" xmlns:w16cid="http://schemas.microsoft.com/office/word/2016/wordml/cid" xmlns:w16="http://schemas.microsoft.com/office/word/2018/wordml" xmlns:w16sdtdh="http://schemas.microsoft.com/office/word/2020/wordml/sdtdatahash" xmlns:w16se="http://schemas.microsoft.com/office/word/2015/wordml/symex" xmlns:wpg="http://schemas.microsoft.com/office/word/2010/wordprocessingGroup" xmlns:wpi="http://schemas.microsoft.com/office/word/2010/wordprocessingInk" xmlns:wne="http://schemas.microsoft.com/office/word/2006/wordml" xmlns:wps="http://schemas.microsoft.com/office/word/2010/wordprocessingShape" mc:Ignorable="w14 w15 w16se w16cid w16 w16cex w16sdtdh wp14">
+<w:hdr xmlns:wpc="http://schemas.microsoft.com/office/word/2010/wordprocessingCanvas" xmlns:cx="http://schemas.microsoft.com/office/drawing/2014/chartex" xmlns:cx1="http://schemas.microsoft.com/office/drawing/2015/9/8/chartex" xmlns:cx2="http://schemas.microsoft.com/office/drawing/2015/10/21/chartex" xmlns:cx3="http://schemas.microsoft.com/office/drawing/2016/5/9/chartex" xmlns:cx4="http://schemas.microsoft.com/office/drawing/2016/5/10/chartex" xmlns:cx5="http://schemas.microsoft.com/office/drawing/2016/5/11/chartex" xmlns:cx6="http://schemas.microsoft.com/office/drawing/2016/5/12/chartex" xmlns:cx7="http://schemas.microsoft.com/office/drawing/2016/5/13/chartex" xmlns:cx8="http://schemas.microsoft.com/office/drawing/2016/5/14/chartex" xmlns:mc="http://schemas.openxmlformats.org/markup-compatibility/2006" xmlns:aink="http://schemas.microsoft.com/office/drawing/2016/ink" xmlns:am3d="http://schemas.microsoft.com/office/drawing/2017/model3d" xmlns:o="urn:schemas-microsoft-com:office:office" xmlns:oel="http://schemas.microsoft.com/office/2019/extlst" xmlns:r="http://schemas.openxmlformats.org/officeDocument/2006/relationships" xmlns:m="http://schemas.openxmlformats.org/officeDocument/2006/math" xmlns:v="urn:schemas-microsoft-com:vml" xmlns:wp14="http://schemas.microsoft.com/office/word/2010/wordprocessingDrawing" xmlns:wp="http://schemas.openxmlformats.org/drawingml/2006/wordprocessingDrawing" xmlns:w10="urn:schemas-microsoft-com:office:word" xmlns:w="http://schemas.openxmlformats.org/wordprocessingml/2006/main" xmlns:w14="http://schemas.microsoft.com/office/word/2010/wordml" xmlns:w15="http://schemas.microsoft.com/office/word/2012/wordml" xmlns:w16cex="http://schemas.microsoft.com/office/word/2018/wordml/cex" xmlns:w16cid="http://schemas.microsoft.com/office/word/2016/wordml/cid" xmlns:w16="http://schemas.microsoft.com/office/word/2018/wordml" xmlns:w16du="http://schemas.microsoft.com/office/word/2023/wordml/word16du" xmlns:w16sdtdh="http://schemas.microsoft.com/office/word/2020/wordml/sdtdatahash" xmlns:w16sdtfl="http://schemas.microsoft.com/office/word/2024/wordml/sdtformatlock" xmlns:w16se="http://schemas.microsoft.com/office/word/2015/wordml/symex" xmlns:wpg="http://schemas.microsoft.com/office/word/2010/wordprocessingGroup" xmlns:wpi="http://schemas.microsoft.com/office/word/2010/wordprocessingInk" xmlns:wne="http://schemas.microsoft.com/office/word/2006/wordml" xmlns:wps="http://schemas.microsoft.com/office/word/2010/wordprocessingShape" mc:Ignorable="w14 w15 w16se w16cid w16 w16cex w16sdtdh w16sdtfl w16du wp14">
   <w:p>
     <w:pPr>
       <w:pStyle w:val="a4"/>
@@ -4539,7 +4639,7 @@
 </file>
 
 <file path=word/header3.xml><?xml version="1.0" encoding="utf-8"?>
-<w:hdr xmlns:wpc="http://schemas.microsoft.com/office/word/2010/wordprocessingCanvas" xmlns:cx="http://schemas.microsoft.com/office/drawing/2014/chartex" xmlns:cx1="http://schemas.microsoft.com/office/drawing/2015/9/8/chartex" xmlns:cx2="http://schemas.microsoft.com/office/drawing/2015/10/21/chartex" xmlns:cx3="http://schemas.microsoft.com/office/drawing/2016/5/9/chartex" xmlns:cx4="http://schemas.microsoft.com/office/drawing/2016/5/10/chartex" xmlns:cx5="http://schemas.microsoft.com/office/drawing/2016/5/11/chartex" xmlns:cx6="http://schemas.microsoft.com/office/drawing/2016/5/12/chartex" xmlns:cx7="http://schemas.microsoft.com/office/drawing/2016/5/13/chartex" xmlns:cx8="http://schemas.microsoft.com/office/drawing/2016/5/14/chartex" xmlns:mc="http://schemas.openxmlformats.org/markup-compatibility/2006" xmlns:aink="http://schemas.microsoft.com/office/drawing/2016/ink" xmlns:am3d="http://schemas.microsoft.com/office/drawing/2017/model3d" xmlns:o="urn:schemas-microsoft-com:office:office" xmlns:r="http://schemas.openxmlformats.org/officeDocument/2006/relationships" xmlns:m="http://schemas.openxmlformats.org/officeDocument/2006/math" xmlns:v="urn:schemas-microsoft-com:vml" xmlns:wp14="http://schemas.microsoft.com/office/word/2010/wordprocessingDrawing" xmlns:wp="http://schemas.openxmlformats.org/drawingml/2006/wordprocessingDrawing" xmlns:w10="urn:schemas-microsoft-com:office:word" xmlns:w="http://schemas.openxmlformats.org/wordprocessingml/2006/main" xmlns:w14="http://schemas.microsoft.com/office/word/2010/wordml" xmlns:w15="http://schemas.microsoft.com/office/word/2012/wordml" xmlns:w16cex="http://schemas.microsoft.com/office/word/2018/wordml/cex" xmlns:w16cid="http://schemas.microsoft.com/office/word/2016/wordml/cid" xmlns:w16="http://schemas.microsoft.com/office/word/2018/wordml" xmlns:w16sdtdh="http://schemas.microsoft.com/office/word/2020/wordml/sdtdatahash" xmlns:w16se="http://schemas.microsoft.com/office/word/2015/wordml/symex" xmlns:wpg="http://schemas.microsoft.com/office/word/2010/wordprocessingGroup" xmlns:wpi="http://schemas.microsoft.com/office/word/2010/wordprocessingInk" xmlns:wne="http://schemas.microsoft.com/office/word/2006/wordml" xmlns:wps="http://schemas.microsoft.com/office/word/2010/wordprocessingShape" mc:Ignorable="w14 w15 w16se w16cid w16 w16cex w16sdtdh wp14">
+<w:hdr xmlns:wpc="http://schemas.microsoft.com/office/word/2010/wordprocessingCanvas" xmlns:cx="http://schemas.microsoft.com/office/drawing/2014/chartex" xmlns:cx1="http://schemas.microsoft.com/office/drawing/2015/9/8/chartex" xmlns:cx2="http://schemas.microsoft.com/office/drawing/2015/10/21/chartex" xmlns:cx3="http://schemas.microsoft.com/office/drawing/2016/5/9/chartex" xmlns:cx4="http://schemas.microsoft.com/office/drawing/2016/5/10/chartex" xmlns:cx5="http://schemas.microsoft.com/office/drawing/2016/5/11/chartex" xmlns:cx6="http://schemas.microsoft.com/office/drawing/2016/5/12/chartex" xmlns:cx7="http://schemas.microsoft.com/office/drawing/2016/5/13/chartex" xmlns:cx8="http://schemas.microsoft.com/office/drawing/2016/5/14/chartex" xmlns:mc="http://schemas.openxmlformats.org/markup-compatibility/2006" xmlns:aink="http://schemas.microsoft.com/office/drawing/2016/ink" xmlns:am3d="http://schemas.microsoft.com/office/drawing/2017/model3d" xmlns:o="urn:schemas-microsoft-com:office:office" xmlns:oel="http://schemas.microsoft.com/office/2019/extlst" xmlns:r="http://schemas.openxmlformats.org/officeDocument/2006/relationships" xmlns:m="http://schemas.openxmlformats.org/officeDocument/2006/math" xmlns:v="urn:schemas-microsoft-com:vml" xmlns:wp14="http://schemas.microsoft.com/office/word/2010/wordprocessingDrawing" xmlns:wp="http://schemas.openxmlformats.org/drawingml/2006/wordprocessingDrawing" xmlns:w10="urn:schemas-microsoft-com:office:word" xmlns:w="http://schemas.openxmlformats.org/wordprocessingml/2006/main" xmlns:w14="http://schemas.microsoft.com/office/word/2010/wordml" xmlns:w15="http://schemas.microsoft.com/office/word/2012/wordml" xmlns:w16cex="http://schemas.microsoft.com/office/word/2018/wordml/cex" xmlns:w16cid="http://schemas.microsoft.com/office/word/2016/wordml/cid" xmlns:w16="http://schemas.microsoft.com/office/word/2018/wordml" xmlns:w16du="http://schemas.microsoft.com/office/word/2023/wordml/word16du" xmlns:w16sdtdh="http://schemas.microsoft.com/office/word/2020/wordml/sdtdatahash" xmlns:w16sdtfl="http://schemas.microsoft.com/office/word/2024/wordml/sdtformatlock" xmlns:w16se="http://schemas.microsoft.com/office/word/2015/wordml/symex" xmlns:wpg="http://schemas.microsoft.com/office/word/2010/wordprocessingGroup" xmlns:wpi="http://schemas.microsoft.com/office/word/2010/wordprocessingInk" xmlns:wne="http://schemas.microsoft.com/office/word/2006/wordml" xmlns:wps="http://schemas.microsoft.com/office/word/2010/wordprocessingShape" mc:Ignorable="w14 w15 w16se w16cid w16 w16cex w16sdtdh w16sdtfl w16du wp14">
   <w:p>
     <w:pPr>
       <w:pStyle w:val="a4"/>
@@ -4549,7 +4649,7 @@
 </file>
 
 <file path=word/numbering.xml><?xml version="1.0" encoding="utf-8"?>
-<w:numbering xmlns:wpc="http://schemas.microsoft.com/office/word/2010/wordprocessingCanvas" xmlns:cx="http://schemas.microsoft.com/office/drawing/2014/chartex" xmlns:cx1="http://schemas.microsoft.com/office/drawing/2015/9/8/chartex" xmlns:cx2="http://schemas.microsoft.com/office/drawing/2015/10/21/chartex" xmlns:cx3="http://schemas.microsoft.com/office/drawing/2016/5/9/chartex" xmlns:cx4="http://schemas.microsoft.com/office/drawing/2016/5/10/chartex" xmlns:cx5="http://schemas.microsoft.com/office/drawing/2016/5/11/chartex" xmlns:cx6="http://schemas.microsoft.com/office/drawing/2016/5/12/chartex" xmlns:cx7="http://schemas.microsoft.com/office/drawing/2016/5/13/chartex" xmlns:cx8="http://schemas.microsoft.com/office/drawing/2016/5/14/chartex" xmlns:mc="http://schemas.openxmlformats.org/markup-compatibility/2006" xmlns:aink="http://schemas.microsoft.com/office/drawing/2016/ink" xmlns:am3d="http://schemas.microsoft.com/office/drawing/2017/model3d" xmlns:o="urn:schemas-microsoft-com:office:office" xmlns:r="http://schemas.openxmlformats.org/officeDocument/2006/relationships" xmlns:m="http://schemas.openxmlformats.org/officeDocument/2006/math" xmlns:v="urn:schemas-microsoft-com:vml" xmlns:wp14="http://schemas.microsoft.com/office/word/2010/wordprocessingDrawing" xmlns:wp="http://schemas.openxmlformats.org/drawingml/2006/wordprocessingDrawing" xmlns:w10="urn:schemas-microsoft-com:office:word" xmlns:w="http://schemas.openxmlformats.org/wordprocessingml/2006/main" xmlns:w14="http://schemas.microsoft.com/office/word/2010/wordml" xmlns:w15="http://schemas.microsoft.com/office/word/2012/wordml" xmlns:w16cex="http://schemas.microsoft.com/office/word/2018/wordml/cex" xmlns:w16cid="http://schemas.microsoft.com/office/word/2016/wordml/cid" xmlns:w16="http://schemas.microsoft.com/office/word/2018/wordml" xmlns:w16sdtdh="http://schemas.microsoft.com/office/word/2020/wordml/sdtdatahash" xmlns:w16se="http://schemas.microsoft.com/office/word/2015/wordml/symex" xmlns:wpg="http://schemas.microsoft.com/office/word/2010/wordprocessingGroup" xmlns:wpi="http://schemas.microsoft.com/office/word/2010/wordprocessingInk" xmlns:wne="http://schemas.microsoft.com/office/word/2006/wordml" xmlns:wps="http://schemas.microsoft.com/office/word/2010/wordprocessingShape" mc:Ignorable="w14 w15 w16se w16cid w16 w16cex w16sdtdh wp14">
+<w:numbering xmlns:wpc="http://schemas.microsoft.com/office/word/2010/wordprocessingCanvas" xmlns:cx="http://schemas.microsoft.com/office/drawing/2014/chartex" xmlns:cx1="http://schemas.microsoft.com/office/drawing/2015/9/8/chartex" xmlns:cx2="http://schemas.microsoft.com/office/drawing/2015/10/21/chartex" xmlns:cx3="http://schemas.microsoft.com/office/drawing/2016/5/9/chartex" xmlns:cx4="http://schemas.microsoft.com/office/drawing/2016/5/10/chartex" xmlns:cx5="http://schemas.microsoft.com/office/drawing/2016/5/11/chartex" xmlns:cx6="http://schemas.microsoft.com/office/drawing/2016/5/12/chartex" xmlns:cx7="http://schemas.microsoft.com/office/drawing/2016/5/13/chartex" xmlns:cx8="http://schemas.microsoft.com/office/drawing/2016/5/14/chartex" xmlns:mc="http://schemas.openxmlformats.org/markup-compatibility/2006" xmlns:aink="http://schemas.microsoft.com/office/drawing/2016/ink" xmlns:am3d="http://schemas.microsoft.com/office/drawing/2017/model3d" xmlns:o="urn:schemas-microsoft-com:office:office" xmlns:oel="http://schemas.microsoft.com/office/2019/extlst" xmlns:r="http://schemas.openxmlformats.org/officeDocument/2006/relationships" xmlns:m="http://schemas.openxmlformats.org/officeDocument/2006/math" xmlns:v="urn:schemas-microsoft-com:vml" xmlns:wp14="http://schemas.microsoft.com/office/word/2010/wordprocessingDrawing" xmlns:wp="http://schemas.openxmlformats.org/drawingml/2006/wordprocessingDrawing" xmlns:w10="urn:schemas-microsoft-com:office:word" xmlns:w="http://schemas.openxmlformats.org/wordprocessingml/2006/main" xmlns:w14="http://schemas.microsoft.com/office/word/2010/wordml" xmlns:w15="http://schemas.microsoft.com/office/word/2012/wordml" xmlns:w16cex="http://schemas.microsoft.com/office/word/2018/wordml/cex" xmlns:w16cid="http://schemas.microsoft.com/office/word/2016/wordml/cid" xmlns:w16="http://schemas.microsoft.com/office/word/2018/wordml" xmlns:w16du="http://schemas.microsoft.com/office/word/2023/wordml/word16du" xmlns:w16sdtdh="http://schemas.microsoft.com/office/word/2020/wordml/sdtdatahash" xmlns:w16sdtfl="http://schemas.microsoft.com/office/word/2024/wordml/sdtformatlock" xmlns:w16se="http://schemas.microsoft.com/office/word/2015/wordml/symex" xmlns:wpg="http://schemas.microsoft.com/office/word/2010/wordprocessingGroup" xmlns:wpi="http://schemas.microsoft.com/office/word/2010/wordprocessingInk" xmlns:wne="http://schemas.microsoft.com/office/word/2006/wordml" xmlns:wps="http://schemas.microsoft.com/office/word/2010/wordprocessingShape" mc:Ignorable="w14 w15 w16se w16cid w16 w16cex w16sdtdh w16sdtfl w16du wp14">
   <w:abstractNum w:abstractNumId="0" w15:restartNumberingAfterBreak="0">
     <w:nsid w:val="187611F2"/>
     <w:multiLevelType w:val="hybridMultilevel"/>
@@ -4814,20 +4914,20 @@
       </w:pPr>
     </w:lvl>
   </w:abstractNum>
-  <w:num w:numId="1">
+  <w:num w:numId="1" w16cid:durableId="1146968039">
     <w:abstractNumId w:val="2"/>
   </w:num>
-  <w:num w:numId="2">
+  <w:num w:numId="2" w16cid:durableId="1816603709">
     <w:abstractNumId w:val="1"/>
   </w:num>
-  <w:num w:numId="3">
+  <w:num w:numId="3" w16cid:durableId="2041734171">
     <w:abstractNumId w:val="0"/>
   </w:num>
 </w:numbering>
 </file>
 
 <file path=word/styles.xml><?xml version="1.0" encoding="utf-8"?>
-<w:styles xmlns:mc="http://schemas.openxmlformats.org/markup-compatibility/2006" xmlns:r="http://schemas.openxmlformats.org/officeDocument/2006/relationships" xmlns:w="http://schemas.openxmlformats.org/wordprocessingml/2006/main" xmlns:w14="http://schemas.microsoft.com/office/word/2010/wordml" xmlns:w15="http://schemas.microsoft.com/office/word/2012/wordml" xmlns:w16cex="http://schemas.microsoft.com/office/word/2018/wordml/cex" xmlns:w16cid="http://schemas.microsoft.com/office/word/2016/wordml/cid" xmlns:w16="http://schemas.microsoft.com/office/word/2018/wordml" xmlns:w16sdtdh="http://schemas.microsoft.com/office/word/2020/wordml/sdtdatahash" xmlns:w16se="http://schemas.microsoft.com/office/word/2015/wordml/symex" mc:Ignorable="w14 w15 w16se w16cid w16 w16cex w16sdtdh">
+<w:styles xmlns:mc="http://schemas.openxmlformats.org/markup-compatibility/2006" xmlns:r="http://schemas.openxmlformats.org/officeDocument/2006/relationships" xmlns:w="http://schemas.openxmlformats.org/wordprocessingml/2006/main" xmlns:w14="http://schemas.microsoft.com/office/word/2010/wordml" xmlns:w15="http://schemas.microsoft.com/office/word/2012/wordml" xmlns:w16cex="http://schemas.microsoft.com/office/word/2018/wordml/cex" xmlns:w16cid="http://schemas.microsoft.com/office/word/2016/wordml/cid" xmlns:w16="http://schemas.microsoft.com/office/word/2018/wordml" xmlns:w16du="http://schemas.microsoft.com/office/word/2023/wordml/word16du" xmlns:w16sdtdh="http://schemas.microsoft.com/office/word/2020/wordml/sdtdatahash" xmlns:w16sdtfl="http://schemas.microsoft.com/office/word/2024/wordml/sdtformatlock" xmlns:w16se="http://schemas.microsoft.com/office/word/2015/wordml/symex" mc:Ignorable="w14 w15 w16se w16cid w16 w16cex w16sdtdh w16sdtfl w16du">
   <w:docDefaults>
     <w:rPrDefault>
       <w:rPr>

</xml_diff>

<commit_message>
vault backup: 2026-09-28 18:08:54
</commit_message>
<xml_diff>
--- a/ПРЕДМЕТЫ/Математические методы и модели поддержки принятия решений/Лабораторные работы/Отчёт_линейное_программирование_Туровец_В_Ю_ПИЭ_1.docx
+++ b/ПРЕДМЕТЫ/Математические методы и модели поддержки принятия решений/Лабораторные работы/Отчёт_линейное_программирование_Туровец_В_Ю_ПИЭ_1.docx
@@ -3359,6 +3359,7 @@
           <w:rFonts w:ascii="Times New Roman" w:hAnsi="Times New Roman" w:cs="Times New Roman"/>
           <w:sz w:val="28"/>
           <w:szCs w:val="28"/>
+          <w:lang w:val="en-US"/>
         </w:rPr>
       </w:pPr>
       <w:r>
@@ -3379,43 +3380,18 @@
           <w:rFonts w:ascii="Times New Roman" w:hAnsi="Times New Roman" w:cs="Times New Roman"/>
           <w:sz w:val="28"/>
           <w:szCs w:val="28"/>
-        </w:rPr>
-      </w:pPr>
-    </w:p>
-    <w:p>
-      <w:pPr>
-        <w:spacing w:line="360" w:lineRule="auto"/>
-        <w:ind w:firstLine="454"/>
-        <w:jc w:val="both"/>
-        <w:rPr>
-          <w:rFonts w:ascii="Times New Roman" w:hAnsi="Times New Roman" w:cs="Times New Roman"/>
-          <w:sz w:val="28"/>
-          <w:szCs w:val="28"/>
-        </w:rPr>
-      </w:pPr>
-    </w:p>
-    <w:p>
-      <w:pPr>
-        <w:spacing w:line="360" w:lineRule="auto"/>
-        <w:jc w:val="center"/>
-        <w:rPr>
-          <w:rFonts w:ascii="Times New Roman" w:hAnsi="Times New Roman" w:cs="Times New Roman"/>
-          <w:sz w:val="28"/>
-          <w:szCs w:val="28"/>
-        </w:rPr>
-      </w:pPr>
-      <w:r>
-        <w:rPr>
-          <w:rFonts w:ascii="Times New Roman" w:hAnsi="Times New Roman" w:cs="Times New Roman"/>
+          <w:lang w:val="en-US"/>
+        </w:rPr>
+      </w:pPr>
+      <w:r>
+        <w:rPr>
           <w:noProof/>
-          <w:sz w:val="28"/>
-          <w:szCs w:val="28"/>
         </w:rPr>
         <w:drawing>
-          <wp:inline distT="0" distB="0" distL="0" distR="0" wp14:anchorId="370A8394" wp14:editId="29668A60">
-            <wp:extent cx="5940425" cy="5561330"/>
-            <wp:effectExtent l="0" t="0" r="3175" b="1270"/>
-            <wp:docPr id="8" name="Рисунок 8"/>
+          <wp:inline distT="0" distB="0" distL="0" distR="0" wp14:anchorId="5D64BFA1" wp14:editId="4F160D62">
+            <wp:extent cx="6300470" cy="5836920"/>
+            <wp:effectExtent l="0" t="0" r="5080" b="0"/>
+            <wp:docPr id="158579334" name="Рисунок 1"/>
             <wp:cNvGraphicFramePr>
               <a:graphicFrameLocks xmlns:a="http://schemas.openxmlformats.org/drawingml/2006/main" noChangeAspect="1"/>
             </wp:cNvGraphicFramePr>
@@ -3423,17 +3399,11 @@
               <a:graphicData uri="http://schemas.openxmlformats.org/drawingml/2006/picture">
                 <pic:pic xmlns:pic="http://schemas.openxmlformats.org/drawingml/2006/picture">
                   <pic:nvPicPr>
-                    <pic:cNvPr id="8" name="Рисунок 8"/>
+                    <pic:cNvPr id="158579334" name=""/>
                     <pic:cNvPicPr/>
                   </pic:nvPicPr>
                   <pic:blipFill>
-                    <a:blip r:embed="rId10">
-                      <a:extLst>
-                        <a:ext uri="{28A0092B-C50C-407E-A947-70E740481C1C}">
-                          <a14:useLocalDpi xmlns:a14="http://schemas.microsoft.com/office/drawing/2010/main" val="0"/>
-                        </a:ext>
-                      </a:extLst>
-                    </a:blip>
+                    <a:blip r:embed="rId10"/>
                     <a:stretch>
                       <a:fillRect/>
                     </a:stretch>
@@ -3441,7 +3411,7 @@
                   <pic:spPr>
                     <a:xfrm>
                       <a:off x="0" y="0"/>
-                      <a:ext cx="5940425" cy="5561330"/>
+                      <a:ext cx="6300470" cy="5836920"/>
                     </a:xfrm>
                     <a:prstGeom prst="rect">
                       <a:avLst/>
@@ -3463,14 +3433,23 @@
           <w:rFonts w:ascii="Times New Roman" w:hAnsi="Times New Roman" w:cs="Times New Roman"/>
           <w:sz w:val="28"/>
           <w:szCs w:val="28"/>
-        </w:rPr>
-      </w:pPr>
-    </w:p>
-    <w:p>
-      <w:pPr>
-        <w:spacing w:line="360" w:lineRule="auto"/>
-        <w:ind w:firstLine="454"/>
-        <w:jc w:val="center"/>
+          <w:lang w:val="en-US"/>
+        </w:rPr>
+      </w:pPr>
+      <w:r>
+        <w:rPr>
+          <w:rFonts w:ascii="Times New Roman" w:hAnsi="Times New Roman" w:cs="Times New Roman"/>
+          <w:sz w:val="28"/>
+          <w:szCs w:val="28"/>
+        </w:rPr>
+        <w:t>Рисунок 2 – Ввод данных в окне «Поиск решения»</w:t>
+      </w:r>
+    </w:p>
+    <w:p>
+      <w:pPr>
+        <w:spacing w:line="360" w:lineRule="auto"/>
+        <w:ind w:firstLine="454"/>
+        <w:jc w:val="both"/>
         <w:rPr>
           <w:rFonts w:ascii="Times New Roman" w:hAnsi="Times New Roman" w:cs="Times New Roman"/>
           <w:sz w:val="28"/>
@@ -3484,39 +3463,25 @@
           <w:szCs w:val="28"/>
         </w:rPr>
         <w:lastRenderedPageBreak/>
-        <w:t>Рисунок 2 – Ввод данных в окне «Поиск решения»</w:t>
-      </w:r>
-    </w:p>
-    <w:p>
-      <w:pPr>
-        <w:spacing w:line="360" w:lineRule="auto"/>
-        <w:ind w:firstLine="454"/>
-        <w:jc w:val="center"/>
-        <w:rPr>
-          <w:rFonts w:ascii="Times New Roman" w:hAnsi="Times New Roman" w:cs="Times New Roman"/>
-          <w:sz w:val="28"/>
-          <w:szCs w:val="28"/>
-        </w:rPr>
-      </w:pPr>
-    </w:p>
-    <w:p>
-      <w:pPr>
-        <w:spacing w:line="360" w:lineRule="auto"/>
-        <w:ind w:firstLine="454"/>
-        <w:jc w:val="both"/>
-        <w:rPr>
-          <w:rFonts w:ascii="Times New Roman" w:hAnsi="Times New Roman" w:cs="Times New Roman"/>
-          <w:sz w:val="28"/>
-          <w:szCs w:val="28"/>
-        </w:rPr>
-      </w:pPr>
-      <w:r>
-        <w:rPr>
-          <w:rFonts w:ascii="Times New Roman" w:hAnsi="Times New Roman" w:cs="Times New Roman"/>
-          <w:sz w:val="28"/>
-          <w:szCs w:val="28"/>
-        </w:rPr>
-        <w:t xml:space="preserve">2. В поле Установить целевую ячейку вводится </w:t>
+        <w:t xml:space="preserve">2. В </w:t>
+      </w:r>
+      <w:proofErr w:type="gramStart"/>
+      <w:r>
+        <w:rPr>
+          <w:rFonts w:ascii="Times New Roman" w:hAnsi="Times New Roman" w:cs="Times New Roman"/>
+          <w:sz w:val="28"/>
+          <w:szCs w:val="28"/>
+        </w:rPr>
+        <w:t>поле</w:t>
+      </w:r>
+      <w:proofErr w:type="gramEnd"/>
+      <w:r>
+        <w:rPr>
+          <w:rFonts w:ascii="Times New Roman" w:hAnsi="Times New Roman" w:cs="Times New Roman"/>
+          <w:sz w:val="28"/>
+          <w:szCs w:val="28"/>
+        </w:rPr>
+        <w:t xml:space="preserve"> Установить целевую ячейку вводится </w:t>
       </w:r>
       <w:hyperlink r:id="rId11" w:history="1">
         <w:r>
@@ -3615,6 +3580,7 @@
           <w:rFonts w:ascii="Times New Roman" w:hAnsi="Times New Roman" w:cs="Times New Roman"/>
           <w:sz w:val="28"/>
           <w:szCs w:val="28"/>
+          <w:lang w:val="en-US"/>
         </w:rPr>
       </w:pPr>
       <w:r>
@@ -3677,17 +3643,6 @@
           <w:szCs w:val="28"/>
         </w:rPr>
       </w:pPr>
-    </w:p>
-    <w:p>
-      <w:pPr>
-        <w:spacing w:line="360" w:lineRule="auto"/>
-        <w:jc w:val="center"/>
-        <w:rPr>
-          <w:rFonts w:ascii="Times New Roman" w:hAnsi="Times New Roman" w:cs="Times New Roman"/>
-          <w:sz w:val="28"/>
-          <w:szCs w:val="28"/>
-        </w:rPr>
-      </w:pPr>
       <w:r>
         <w:rPr>
           <w:rFonts w:ascii="Times New Roman" w:hAnsi="Times New Roman" w:cs="Times New Roman"/>
@@ -3930,26 +3885,34 @@
           <w:sz w:val="28"/>
           <w:szCs w:val="28"/>
         </w:rPr>
+        <w:t xml:space="preserve">Установка флажка Линейная модель в диалоговом окне Параметры </w:t>
+      </w:r>
+      <w:proofErr w:type="gramStart"/>
+      <w:r>
+        <w:rPr>
+          <w:rFonts w:ascii="Times New Roman" w:hAnsi="Times New Roman" w:cs="Times New Roman"/>
+          <w:sz w:val="28"/>
+          <w:szCs w:val="28"/>
+        </w:rPr>
+        <w:t>поиска  решения</w:t>
+      </w:r>
+      <w:proofErr w:type="gramEnd"/>
+      <w:r>
+        <w:rPr>
+          <w:rFonts w:ascii="Times New Roman" w:hAnsi="Times New Roman" w:cs="Times New Roman"/>
+          <w:sz w:val="28"/>
+          <w:szCs w:val="28"/>
+        </w:rPr>
+        <w:t xml:space="preserve"> (см. рис. 11), которое открывается при нажатии на кнопку Параметры в окне Поиск решения, позволяет задать любое количество ограничений. При </w:t>
+      </w:r>
+      <w:r>
+        <w:rPr>
+          <w:rFonts w:ascii="Times New Roman" w:hAnsi="Times New Roman" w:cs="Times New Roman"/>
+          <w:sz w:val="28"/>
+          <w:szCs w:val="28"/>
+        </w:rPr>
         <w:lastRenderedPageBreak/>
-        <w:t xml:space="preserve">Установка флажка Линейная модель в диалоговом окне Параметры </w:t>
-      </w:r>
-      <w:proofErr w:type="gramStart"/>
-      <w:r>
-        <w:rPr>
-          <w:rFonts w:ascii="Times New Roman" w:hAnsi="Times New Roman" w:cs="Times New Roman"/>
-          <w:sz w:val="28"/>
-          <w:szCs w:val="28"/>
-        </w:rPr>
-        <w:t>поиска  решения</w:t>
-      </w:r>
-      <w:proofErr w:type="gramEnd"/>
-      <w:r>
-        <w:rPr>
-          <w:rFonts w:ascii="Times New Roman" w:hAnsi="Times New Roman" w:cs="Times New Roman"/>
-          <w:sz w:val="28"/>
-          <w:szCs w:val="28"/>
-        </w:rPr>
-        <w:t xml:space="preserve"> (см. рис. 11), которое открывается при нажатии на кнопку Параметры в окне Поиск решения, позволяет задать любое количество ограничений. При решении нелинейных задач на каждую из изменяющихся ячеек можно наложить до 100 ограничений (в дополнение к целочисленным ограничениям на переменные).</w:t>
+        <w:t>решении нелинейных задач на каждую из изменяющихся ячеек можно наложить до 100 ограничений (в дополнение к целочисленным ограничениям на переменные).</w:t>
       </w:r>
     </w:p>
     <w:p>
@@ -4083,7 +4046,6 @@
           <w:sz w:val="28"/>
           <w:szCs w:val="28"/>
         </w:rPr>
-        <w:lastRenderedPageBreak/>
         <w:t xml:space="preserve">5. После ввода ограничений в окне Поиск решения необходимо нажать на кнопку Выполнить. Появится окно Результаты поиска решения, изображённое на рисунке 5. </w:t>
       </w:r>
     </w:p>

</xml_diff>

<commit_message>
vault backup: 2026-09-28 18:10:27
</commit_message>
<xml_diff>
--- a/ПРЕДМЕТЫ/Математические методы и модели поддержки принятия решений/Лабораторные работы/Отчёт_линейное_программирование_Туровец_В_Ю_ПИЭ_1.docx
+++ b/ПРЕДМЕТЫ/Математические методы и модели поддержки принятия решений/Лабораторные работы/Отчёт_линейное_программирование_Туровец_В_Ю_ПИЭ_1.docx
@@ -3203,36 +3203,32 @@
     <w:p>
       <w:pPr>
         <w:spacing w:line="360" w:lineRule="auto"/>
-        <w:ind w:firstLine="454"/>
         <w:jc w:val="both"/>
         <w:rPr>
           <w:rFonts w:ascii="Times New Roman" w:hAnsi="Times New Roman" w:cs="Times New Roman"/>
           <w:sz w:val="28"/>
           <w:szCs w:val="28"/>
-        </w:rPr>
-      </w:pPr>
-      <w:r>
-        <w:rPr>
-          <w:rFonts w:ascii="Times New Roman" w:hAnsi="Times New Roman" w:cs="Times New Roman"/>
-          <w:sz w:val="28"/>
-          <w:szCs w:val="28"/>
-        </w:rPr>
+          <w:lang w:val="en-US"/>
+        </w:rPr>
+      </w:pPr>
+      <w:r>
+        <w:rPr>
+          <w:rFonts w:ascii="Times New Roman" w:hAnsi="Times New Roman" w:cs="Times New Roman"/>
+          <w:sz w:val="28"/>
+          <w:szCs w:val="28"/>
+        </w:rPr>
+        <w:lastRenderedPageBreak/>
         <w:tab/>
       </w:r>
       <w:r>
         <w:rPr>
-          <w:rFonts w:ascii="Times New Roman" w:hAnsi="Times New Roman" w:cs="Times New Roman"/>
-          <w:b/>
-          <w:bCs/>
           <w:noProof/>
-          <w:sz w:val="28"/>
-          <w:szCs w:val="28"/>
         </w:rPr>
         <w:drawing>
-          <wp:inline distT="0" distB="0" distL="0" distR="0" wp14:anchorId="7BF18091" wp14:editId="7ADE23A6">
-            <wp:extent cx="5940425" cy="3623945"/>
-            <wp:effectExtent l="0" t="0" r="3175" b="0"/>
-            <wp:docPr id="4" name="Рисунок 4"/>
+          <wp:inline distT="0" distB="0" distL="0" distR="0" wp14:anchorId="7CF3A3C6" wp14:editId="2A88B69B">
+            <wp:extent cx="6300470" cy="4346575"/>
+            <wp:effectExtent l="0" t="0" r="5080" b="0"/>
+            <wp:docPr id="1030576" name="Рисунок 1"/>
             <wp:cNvGraphicFramePr>
               <a:graphicFrameLocks xmlns:a="http://schemas.openxmlformats.org/drawingml/2006/main" noChangeAspect="1"/>
             </wp:cNvGraphicFramePr>
@@ -3240,17 +3236,11 @@
               <a:graphicData uri="http://schemas.openxmlformats.org/drawingml/2006/picture">
                 <pic:pic xmlns:pic="http://schemas.openxmlformats.org/drawingml/2006/picture">
                   <pic:nvPicPr>
-                    <pic:cNvPr id="4" name="Рисунок 4"/>
+                    <pic:cNvPr id="1030576" name=""/>
                     <pic:cNvPicPr/>
                   </pic:nvPicPr>
                   <pic:blipFill>
-                    <a:blip r:embed="rId9">
-                      <a:extLst>
-                        <a:ext uri="{28A0092B-C50C-407E-A947-70E740481C1C}">
-                          <a14:useLocalDpi xmlns:a14="http://schemas.microsoft.com/office/drawing/2010/main" val="0"/>
-                        </a:ext>
-                      </a:extLst>
-                    </a:blip>
+                    <a:blip r:embed="rId9"/>
                     <a:stretch>
                       <a:fillRect/>
                     </a:stretch>
@@ -3258,7 +3248,7 @@
                   <pic:spPr>
                     <a:xfrm>
                       <a:off x="0" y="0"/>
-                      <a:ext cx="5940425" cy="3623945"/>
+                      <a:ext cx="6300470" cy="4346575"/>
                     </a:xfrm>
                     <a:prstGeom prst="rect">
                       <a:avLst/>
@@ -3288,7 +3278,6 @@
           <w:sz w:val="28"/>
           <w:szCs w:val="28"/>
         </w:rPr>
-        <w:lastRenderedPageBreak/>
         <w:t xml:space="preserve">Рисунок 1 – Подготовка рабочего листа к вычислениям с помощью надстройки «Поиск решения» в </w:t>
       </w:r>
       <w:r>
@@ -3387,6 +3376,7 @@
         <w:rPr>
           <w:noProof/>
         </w:rPr>
+        <w:lastRenderedPageBreak/>
         <w:drawing>
           <wp:inline distT="0" distB="0" distL="0" distR="0" wp14:anchorId="5D64BFA1" wp14:editId="4F160D62">
             <wp:extent cx="6300470" cy="5836920"/>
@@ -3462,7 +3452,6 @@
           <w:sz w:val="28"/>
           <w:szCs w:val="28"/>
         </w:rPr>
-        <w:lastRenderedPageBreak/>
         <w:t xml:space="preserve">2. В </w:t>
       </w:r>
       <w:proofErr w:type="gramStart"/>
@@ -3590,6 +3579,7 @@
           <w:sz w:val="28"/>
           <w:szCs w:val="28"/>
         </w:rPr>
+        <w:lastRenderedPageBreak/>
         <w:drawing>
           <wp:inline distT="0" distB="0" distL="0" distR="0" wp14:anchorId="5DD754E6" wp14:editId="28E0D519">
             <wp:extent cx="5029200" cy="1612900"/>
@@ -3903,16 +3893,7 @@
           <w:sz w:val="28"/>
           <w:szCs w:val="28"/>
         </w:rPr>
-        <w:t xml:space="preserve"> (см. рис. 11), которое открывается при нажатии на кнопку Параметры в окне Поиск решения, позволяет задать любое количество ограничений. При </w:t>
-      </w:r>
-      <w:r>
-        <w:rPr>
-          <w:rFonts w:ascii="Times New Roman" w:hAnsi="Times New Roman" w:cs="Times New Roman"/>
-          <w:sz w:val="28"/>
-          <w:szCs w:val="28"/>
-        </w:rPr>
-        <w:lastRenderedPageBreak/>
-        <w:t>решении нелинейных задач на каждую из изменяющихся ячеек можно наложить до 100 ограничений (в дополнение к целочисленным ограничениям на переменные).</w:t>
+        <w:t xml:space="preserve"> (см. рис. 11), которое открывается при нажатии на кнопку Параметры в окне Поиск решения, позволяет задать любое количество ограничений. При решении нелинейных задач на каждую из изменяющихся ячеек можно наложить до 100 ограничений (в дополнение к целочисленным ограничениям на переменные).</w:t>
       </w:r>
     </w:p>
     <w:p>
@@ -3944,6 +3925,7 @@
           <w:sz w:val="28"/>
           <w:szCs w:val="28"/>
         </w:rPr>
+        <w:lastRenderedPageBreak/>
         <w:drawing>
           <wp:inline distT="0" distB="0" distL="0" distR="0" wp14:anchorId="545BD5E1" wp14:editId="6229029C">
             <wp:extent cx="4469936" cy="5571066"/>
@@ -4079,6 +4061,7 @@
           <w:sz w:val="28"/>
           <w:szCs w:val="28"/>
         </w:rPr>
+        <w:lastRenderedPageBreak/>
         <w:drawing>
           <wp:inline distT="0" distB="0" distL="0" distR="0" wp14:anchorId="5A560DC3" wp14:editId="325ACBAE">
             <wp:extent cx="5940425" cy="3952875"/>
@@ -4229,52 +4212,57 @@
           <w:rFonts w:ascii="Times New Roman" w:hAnsi="Times New Roman" w:cs="Times New Roman"/>
           <w:sz w:val="28"/>
           <w:szCs w:val="28"/>
-        </w:rPr>
-      </w:pPr>
-      <w:r>
-        <w:rPr>
-          <w:rFonts w:ascii="Times New Roman" w:hAnsi="Times New Roman" w:cs="Times New Roman"/>
-          <w:sz w:val="28"/>
-          <w:szCs w:val="28"/>
-        </w:rPr>
-        <w:t>6. После сохранения найденного решения, появится рабочий лист, изображённый на рисунке 6.</w:t>
+          <w:lang w:val="en-US"/>
+        </w:rPr>
+      </w:pPr>
+      <w:r>
+        <w:rPr>
+          <w:rFonts w:ascii="Times New Roman" w:hAnsi="Times New Roman" w:cs="Times New Roman"/>
+          <w:sz w:val="28"/>
+          <w:szCs w:val="28"/>
+        </w:rPr>
+        <w:t xml:space="preserve">6. </w:t>
+      </w:r>
+      <w:proofErr w:type="gramStart"/>
+      <w:r>
+        <w:rPr>
+          <w:rFonts w:ascii="Times New Roman" w:hAnsi="Times New Roman" w:cs="Times New Roman"/>
+          <w:sz w:val="28"/>
+          <w:szCs w:val="28"/>
+        </w:rPr>
+        <w:t>После сохранения найденного решения,</w:t>
+      </w:r>
+      <w:proofErr w:type="gramEnd"/>
+      <w:r>
+        <w:rPr>
+          <w:rFonts w:ascii="Times New Roman" w:hAnsi="Times New Roman" w:cs="Times New Roman"/>
+          <w:sz w:val="28"/>
+          <w:szCs w:val="28"/>
+        </w:rPr>
+        <w:t xml:space="preserve"> появится рабочий лист, изображённый на рисунке 6.</w:t>
       </w:r>
     </w:p>
     <w:p>
       <w:pPr>
         <w:spacing w:line="360" w:lineRule="auto"/>
         <w:ind w:firstLine="454"/>
-        <w:jc w:val="both"/>
-        <w:rPr>
-          <w:rFonts w:ascii="Times New Roman" w:hAnsi="Times New Roman" w:cs="Times New Roman"/>
-          <w:sz w:val="28"/>
-          <w:szCs w:val="28"/>
-        </w:rPr>
-      </w:pPr>
-    </w:p>
-    <w:p>
-      <w:pPr>
-        <w:spacing w:line="360" w:lineRule="auto"/>
-        <w:jc w:val="center"/>
-        <w:rPr>
-          <w:rFonts w:ascii="Times New Roman" w:hAnsi="Times New Roman" w:cs="Times New Roman"/>
-          <w:sz w:val="28"/>
-          <w:szCs w:val="28"/>
-        </w:rPr>
-      </w:pPr>
-      <w:r>
-        <w:rPr>
-          <w:rFonts w:ascii="Times New Roman" w:hAnsi="Times New Roman" w:cs="Times New Roman"/>
+        <w:jc w:val="center"/>
+        <w:rPr>
+          <w:rFonts w:ascii="Times New Roman" w:hAnsi="Times New Roman" w:cs="Times New Roman"/>
+          <w:sz w:val="28"/>
+          <w:szCs w:val="28"/>
+        </w:rPr>
+      </w:pPr>
+      <w:r>
+        <w:rPr>
           <w:noProof/>
-          <w:sz w:val="28"/>
-          <w:szCs w:val="28"/>
         </w:rPr>
         <w:lastRenderedPageBreak/>
         <w:drawing>
-          <wp:inline distT="0" distB="0" distL="0" distR="0" wp14:anchorId="6044A3E2" wp14:editId="444FEE7E">
-            <wp:extent cx="5940425" cy="3434715"/>
-            <wp:effectExtent l="0" t="0" r="3175" b="0"/>
-            <wp:docPr id="6" name="Рисунок 6"/>
+          <wp:inline distT="0" distB="0" distL="0" distR="0" wp14:anchorId="089ABAD5" wp14:editId="17403596">
+            <wp:extent cx="6300470" cy="4490720"/>
+            <wp:effectExtent l="0" t="0" r="5080" b="5080"/>
+            <wp:docPr id="134560355" name="Рисунок 1"/>
             <wp:cNvGraphicFramePr>
               <a:graphicFrameLocks xmlns:a="http://schemas.openxmlformats.org/drawingml/2006/main" noChangeAspect="1"/>
             </wp:cNvGraphicFramePr>
@@ -4282,17 +4270,11 @@
               <a:graphicData uri="http://schemas.openxmlformats.org/drawingml/2006/picture">
                 <pic:pic xmlns:pic="http://schemas.openxmlformats.org/drawingml/2006/picture">
                   <pic:nvPicPr>
-                    <pic:cNvPr id="6" name="Рисунок 6"/>
+                    <pic:cNvPr id="134560355" name=""/>
                     <pic:cNvPicPr/>
                   </pic:nvPicPr>
                   <pic:blipFill>
-                    <a:blip r:embed="rId19">
-                      <a:extLst>
-                        <a:ext uri="{28A0092B-C50C-407E-A947-70E740481C1C}">
-                          <a14:useLocalDpi xmlns:a14="http://schemas.microsoft.com/office/drawing/2010/main" val="0"/>
-                        </a:ext>
-                      </a:extLst>
-                    </a:blip>
+                    <a:blip r:embed="rId19"/>
                     <a:stretch>
                       <a:fillRect/>
                     </a:stretch>
@@ -4300,7 +4282,7 @@
                   <pic:spPr>
                     <a:xfrm>
                       <a:off x="0" y="0"/>
-                      <a:ext cx="5940425" cy="3434715"/>
+                      <a:ext cx="6300470" cy="4490720"/>
                     </a:xfrm>
                     <a:prstGeom prst="rect">
                       <a:avLst/>
@@ -4312,18 +4294,6 @@
           </wp:inline>
         </w:drawing>
       </w:r>
-    </w:p>
-    <w:p>
-      <w:pPr>
-        <w:spacing w:line="360" w:lineRule="auto"/>
-        <w:ind w:firstLine="454"/>
-        <w:jc w:val="center"/>
-        <w:rPr>
-          <w:rFonts w:ascii="Times New Roman" w:hAnsi="Times New Roman" w:cs="Times New Roman"/>
-          <w:sz w:val="28"/>
-          <w:szCs w:val="28"/>
-        </w:rPr>
-      </w:pPr>
     </w:p>
     <w:p>
       <w:pPr>

</xml_diff>